<commit_message>
Updated the root readme.md
</commit_message>
<xml_diff>
--- a/Tech questions developer assignment.docx
+++ b/Tech questions developer assignment.docx
@@ -5438,6 +5438,2215 @@
           <w:lang w:val="en-US"/>
         </w:rPr>
       </w:pPr>
+      <w:r>
+        <w:rPr>
+          <w:sz w:val="32"/>
+          <w:szCs w:val="32"/>
+          <w:lang w:val="en-US"/>
+        </w:rPr>
+        <w:t xml:space="preserve">Selector 2 – </w:t>
+      </w:r>
+      <w:proofErr w:type="gramStart"/>
+      <w:r>
+        <w:rPr>
+          <w:sz w:val="32"/>
+          <w:szCs w:val="32"/>
+          <w:lang w:val="en-US"/>
+        </w:rPr>
+        <w:t>div .box</w:t>
+      </w:r>
+      <w:proofErr w:type="gramEnd"/>
+    </w:p>
+    <w:p>
+      <w:pPr>
+        <w:rPr>
+          <w:sz w:val="32"/>
+          <w:szCs w:val="32"/>
+          <w:lang w:val="en-US"/>
+        </w:rPr>
+      </w:pPr>
+      <w:r>
+        <w:rPr>
+          <w:sz w:val="32"/>
+          <w:szCs w:val="32"/>
+          <w:lang w:val="en-US"/>
+        </w:rPr>
+        <w:t xml:space="preserve">Explanation - </w:t>
+      </w:r>
+      <w:r>
+        <w:rPr>
+          <w:sz w:val="32"/>
+          <w:szCs w:val="32"/>
+          <w:lang w:val="en-US"/>
+        </w:rPr>
+        <w:t xml:space="preserve">It selects line number 02, 06 and not any other because </w:t>
+      </w:r>
+      <w:proofErr w:type="gramStart"/>
+      <w:r>
+        <w:rPr>
+          <w:sz w:val="32"/>
+          <w:szCs w:val="32"/>
+          <w:lang w:val="en-US"/>
+        </w:rPr>
+        <w:t>div .box</w:t>
+      </w:r>
+      <w:proofErr w:type="gramEnd"/>
+      <w:r>
+        <w:rPr>
+          <w:sz w:val="32"/>
+          <w:szCs w:val="32"/>
+          <w:lang w:val="en-US"/>
+        </w:rPr>
+        <w:t xml:space="preserve"> means select all elements with class box that are descendants of a div </w:t>
+      </w:r>
+      <w:proofErr w:type="spellStart"/>
+      <w:proofErr w:type="gramStart"/>
+      <w:r>
+        <w:rPr>
+          <w:sz w:val="32"/>
+          <w:szCs w:val="32"/>
+          <w:lang w:val="en-US"/>
+        </w:rPr>
+        <w:t>element.Both</w:t>
+      </w:r>
+      <w:proofErr w:type="spellEnd"/>
+      <w:proofErr w:type="gramEnd"/>
+      <w:r>
+        <w:rPr>
+          <w:sz w:val="32"/>
+          <w:szCs w:val="32"/>
+          <w:lang w:val="en-US"/>
+        </w:rPr>
+        <w:t xml:space="preserve"> Line 02 and Line 06 are inside the div with id="container".</w:t>
+      </w:r>
+    </w:p>
+    <w:p>
+      <w:pPr>
+        <w:pStyle w:val="ListParagraph"/>
+        <w:numPr>
+          <w:ilvl w:val="0"/>
+          <w:numId w:val="5"/>
+        </w:numPr>
+        <w:rPr>
+          <w:sz w:val="32"/>
+          <w:szCs w:val="32"/>
+          <w:lang w:val="en-US"/>
+        </w:rPr>
+      </w:pPr>
+      <w:r>
+        <w:rPr>
+          <w:sz w:val="32"/>
+          <w:szCs w:val="32"/>
+          <w:lang w:val="en-US"/>
+        </w:rPr>
+        <w:t>Line 10 is not inside another div element. It is a standalone div with class "box".</w:t>
+      </w:r>
+    </w:p>
+    <w:p>
+      <w:pPr>
+        <w:pStyle w:val="ListParagraph"/>
+        <w:numPr>
+          <w:ilvl w:val="0"/>
+          <w:numId w:val="5"/>
+        </w:numPr>
+        <w:rPr>
+          <w:sz w:val="32"/>
+          <w:szCs w:val="32"/>
+          <w:lang w:val="en-US"/>
+        </w:rPr>
+      </w:pPr>
+      <w:r>
+        <w:rPr>
+          <w:sz w:val="32"/>
+          <w:szCs w:val="32"/>
+          <w:lang w:val="en-US"/>
+        </w:rPr>
+        <w:t>Other lines do not contain class "box".</w:t>
+      </w:r>
+    </w:p>
+    <w:p>
+      <w:pPr>
+        <w:rPr>
+          <w:sz w:val="32"/>
+          <w:szCs w:val="32"/>
+          <w:lang w:val="en-US"/>
+        </w:rPr>
+      </w:pPr>
+      <w:r>
+        <w:rPr>
+          <w:sz w:val="32"/>
+          <w:szCs w:val="32"/>
+          <w:lang w:val="en-US"/>
+        </w:rPr>
+        <w:t xml:space="preserve">Selector 3 – </w:t>
+      </w:r>
+      <w:proofErr w:type="spellStart"/>
+      <w:r>
+        <w:rPr>
+          <w:sz w:val="32"/>
+          <w:szCs w:val="32"/>
+          <w:lang w:val="en-US"/>
+        </w:rPr>
+        <w:t>div.box</w:t>
+      </w:r>
+      <w:proofErr w:type="spellEnd"/>
+    </w:p>
+    <w:p>
+      <w:pPr>
+        <w:rPr>
+          <w:sz w:val="32"/>
+          <w:szCs w:val="32"/>
+          <w:lang w:val="en-US"/>
+        </w:rPr>
+      </w:pPr>
+      <w:r>
+        <w:rPr>
+          <w:sz w:val="32"/>
+          <w:szCs w:val="32"/>
+          <w:lang w:val="en-US"/>
+        </w:rPr>
+        <w:t xml:space="preserve">Explanation - </w:t>
+      </w:r>
+      <w:r>
+        <w:rPr>
+          <w:sz w:val="32"/>
+          <w:szCs w:val="32"/>
+          <w:lang w:val="en-US"/>
+        </w:rPr>
+        <w:t>It selects line number 02, 06</w:t>
+      </w:r>
+      <w:r>
+        <w:rPr>
+          <w:sz w:val="32"/>
+          <w:szCs w:val="32"/>
+          <w:lang w:val="en-US"/>
+        </w:rPr>
+        <w:t>, 10</w:t>
+      </w:r>
+      <w:r>
+        <w:rPr>
+          <w:sz w:val="32"/>
+          <w:szCs w:val="32"/>
+          <w:lang w:val="en-US"/>
+        </w:rPr>
+        <w:t xml:space="preserve"> and not any other because </w:t>
+      </w:r>
+      <w:proofErr w:type="spellStart"/>
+      <w:r>
+        <w:rPr>
+          <w:sz w:val="32"/>
+          <w:szCs w:val="32"/>
+          <w:lang w:val="en-US"/>
+        </w:rPr>
+        <w:t>div.box</w:t>
+      </w:r>
+      <w:proofErr w:type="spellEnd"/>
+      <w:r>
+        <w:rPr>
+          <w:sz w:val="32"/>
+          <w:szCs w:val="32"/>
+          <w:lang w:val="en-US"/>
+        </w:rPr>
+        <w:t xml:space="preserve"> selects div elements that have the class "</w:t>
+      </w:r>
+      <w:proofErr w:type="spellStart"/>
+      <w:r>
+        <w:rPr>
+          <w:sz w:val="32"/>
+          <w:szCs w:val="32"/>
+          <w:lang w:val="en-US"/>
+        </w:rPr>
+        <w:t>box</w:t>
+      </w:r>
+      <w:proofErr w:type="gramStart"/>
+      <w:r>
+        <w:rPr>
+          <w:sz w:val="32"/>
+          <w:szCs w:val="32"/>
+          <w:lang w:val="en-US"/>
+        </w:rPr>
+        <w:t>".All</w:t>
+      </w:r>
+      <w:proofErr w:type="spellEnd"/>
+      <w:proofErr w:type="gramEnd"/>
+      <w:r>
+        <w:rPr>
+          <w:sz w:val="32"/>
+          <w:szCs w:val="32"/>
+          <w:lang w:val="en-US"/>
+        </w:rPr>
+        <w:t xml:space="preserve"> three selected lines are div elements and also contain the class "box".</w:t>
+      </w:r>
+    </w:p>
+    <w:p>
+      <w:pPr>
+        <w:pStyle w:val="ListParagraph"/>
+        <w:numPr>
+          <w:ilvl w:val="0"/>
+          <w:numId w:val="6"/>
+        </w:numPr>
+        <w:rPr>
+          <w:sz w:val="32"/>
+          <w:szCs w:val="32"/>
+          <w:lang w:val="en-US"/>
+        </w:rPr>
+      </w:pPr>
+      <w:r>
+        <w:rPr>
+          <w:sz w:val="32"/>
+          <w:szCs w:val="32"/>
+          <w:lang w:val="en-US"/>
+        </w:rPr>
+        <w:t>Line 01 is a div but does not have class "box".</w:t>
+      </w:r>
+    </w:p>
+    <w:p>
+      <w:pPr>
+        <w:pStyle w:val="ListParagraph"/>
+        <w:numPr>
+          <w:ilvl w:val="0"/>
+          <w:numId w:val="6"/>
+        </w:numPr>
+        <w:rPr>
+          <w:sz w:val="32"/>
+          <w:szCs w:val="32"/>
+          <w:lang w:val="en-US"/>
+        </w:rPr>
+      </w:pPr>
+      <w:r>
+        <w:rPr>
+          <w:sz w:val="32"/>
+          <w:szCs w:val="32"/>
+          <w:lang w:val="en-US"/>
+        </w:rPr>
+        <w:t>Line 04 has class "box2".</w:t>
+      </w:r>
+    </w:p>
+    <w:p>
+      <w:pPr>
+        <w:pStyle w:val="ListParagraph"/>
+        <w:numPr>
+          <w:ilvl w:val="0"/>
+          <w:numId w:val="6"/>
+        </w:numPr>
+        <w:rPr>
+          <w:sz w:val="32"/>
+          <w:szCs w:val="32"/>
+          <w:lang w:val="en-US"/>
+        </w:rPr>
+      </w:pPr>
+      <w:r>
+        <w:rPr>
+          <w:sz w:val="32"/>
+          <w:szCs w:val="32"/>
+          <w:lang w:val="en-US"/>
+        </w:rPr>
+        <w:t>Line 05 does not have class "box".</w:t>
+      </w:r>
+    </w:p>
+    <w:p>
+      <w:pPr>
+        <w:rPr>
+          <w:sz w:val="32"/>
+          <w:szCs w:val="32"/>
+        </w:rPr>
+      </w:pPr>
+      <w:r>
+        <w:rPr>
+          <w:sz w:val="32"/>
+          <w:szCs w:val="32"/>
+          <w:lang w:val="en-US"/>
+        </w:rPr>
+        <w:t>Selector 4 -</w:t>
+      </w:r>
+      <w:r>
+        <w:t xml:space="preserve"> </w:t>
+      </w:r>
+      <w:r>
+        <w:rPr>
+          <w:sz w:val="32"/>
+          <w:szCs w:val="32"/>
+        </w:rPr>
+        <w:t>[class]</w:t>
+      </w:r>
+    </w:p>
+    <w:p>
+      <w:pPr>
+        <w:rPr>
+          <w:sz w:val="32"/>
+          <w:szCs w:val="32"/>
+        </w:rPr>
+      </w:pPr>
+      <w:r>
+        <w:rPr>
+          <w:sz w:val="32"/>
+          <w:szCs w:val="32"/>
+        </w:rPr>
+        <w:t xml:space="preserve">Explanation - </w:t>
+      </w:r>
+      <w:r>
+        <w:rPr>
+          <w:sz w:val="32"/>
+          <w:szCs w:val="32"/>
+          <w:lang w:val="en-US"/>
+        </w:rPr>
+        <w:t>It selects line number 02,</w:t>
+      </w:r>
+      <w:r>
+        <w:rPr>
+          <w:sz w:val="32"/>
+          <w:szCs w:val="32"/>
+          <w:lang w:val="en-US"/>
+        </w:rPr>
+        <w:t xml:space="preserve"> 04,</w:t>
+      </w:r>
+      <w:r>
+        <w:rPr>
+          <w:sz w:val="32"/>
+          <w:szCs w:val="32"/>
+          <w:lang w:val="en-US"/>
+        </w:rPr>
+        <w:t xml:space="preserve"> 06, 10 and not any other because </w:t>
+      </w:r>
+      <w:r>
+        <w:rPr>
+          <w:sz w:val="32"/>
+          <w:szCs w:val="32"/>
+        </w:rPr>
+        <w:t>t</w:t>
+      </w:r>
+      <w:r>
+        <w:rPr>
+          <w:sz w:val="32"/>
+          <w:szCs w:val="32"/>
+        </w:rPr>
+        <w:t>he selector [class] selects every element that contains a class attribute.</w:t>
+      </w:r>
+    </w:p>
+    <w:p>
+      <w:pPr>
+        <w:pStyle w:val="ListParagraph"/>
+        <w:numPr>
+          <w:ilvl w:val="0"/>
+          <w:numId w:val="7"/>
+        </w:numPr>
+        <w:rPr>
+          <w:sz w:val="32"/>
+          <w:szCs w:val="32"/>
+          <w:lang w:val="en-US"/>
+        </w:rPr>
+      </w:pPr>
+      <w:r>
+        <w:rPr>
+          <w:sz w:val="32"/>
+          <w:szCs w:val="32"/>
+          <w:lang w:val="en-US"/>
+        </w:rPr>
+        <w:t>Line 01 contains an id attribute only.</w:t>
+      </w:r>
+    </w:p>
+    <w:p>
+      <w:pPr>
+        <w:pStyle w:val="ListParagraph"/>
+        <w:numPr>
+          <w:ilvl w:val="0"/>
+          <w:numId w:val="7"/>
+        </w:numPr>
+        <w:rPr>
+          <w:sz w:val="32"/>
+          <w:szCs w:val="32"/>
+          <w:lang w:val="en-US"/>
+        </w:rPr>
+      </w:pPr>
+      <w:r>
+        <w:rPr>
+          <w:sz w:val="32"/>
+          <w:szCs w:val="32"/>
+          <w:lang w:val="en-US"/>
+        </w:rPr>
+        <w:t>Line 05 does not contain a class attribute.</w:t>
+      </w:r>
+    </w:p>
+    <w:p>
+      <w:pPr>
+        <w:rPr>
+          <w:sz w:val="32"/>
+          <w:szCs w:val="32"/>
+        </w:rPr>
+      </w:pPr>
+      <w:r>
+        <w:rPr>
+          <w:sz w:val="32"/>
+          <w:szCs w:val="32"/>
+          <w:lang w:val="en-US"/>
+        </w:rPr>
+        <w:t xml:space="preserve">Selector 5 - </w:t>
+      </w:r>
+      <w:r>
+        <w:rPr>
+          <w:sz w:val="32"/>
+          <w:szCs w:val="32"/>
+        </w:rPr>
+        <w:t>#</w:t>
+      </w:r>
+      <w:proofErr w:type="gramStart"/>
+      <w:r>
+        <w:rPr>
+          <w:sz w:val="32"/>
+          <w:szCs w:val="32"/>
+        </w:rPr>
+        <w:t>container .box</w:t>
+      </w:r>
+      <w:proofErr w:type="gramEnd"/>
+    </w:p>
+    <w:p>
+      <w:pPr>
+        <w:rPr>
+          <w:sz w:val="32"/>
+          <w:szCs w:val="32"/>
+          <w:lang w:val="en-US"/>
+        </w:rPr>
+      </w:pPr>
+      <w:r>
+        <w:rPr>
+          <w:sz w:val="32"/>
+          <w:szCs w:val="32"/>
+        </w:rPr>
+        <w:t xml:space="preserve">Explanation - </w:t>
+      </w:r>
+      <w:r>
+        <w:rPr>
+          <w:sz w:val="32"/>
+          <w:szCs w:val="32"/>
+          <w:lang w:val="en-US"/>
+        </w:rPr>
+        <w:t xml:space="preserve">It selects line number 02, 06 and not any other because </w:t>
+      </w:r>
+      <w:r>
+        <w:rPr>
+          <w:sz w:val="32"/>
+          <w:szCs w:val="32"/>
+        </w:rPr>
+        <w:t>t</w:t>
+      </w:r>
+      <w:r>
+        <w:rPr>
+          <w:rFonts w:ascii="Times New Roman" w:eastAsia="Times New Roman" w:hAnsi="Times New Roman" w:cs="Times New Roman"/>
+          <w:sz w:val="24"/>
+          <w:szCs w:val="24"/>
+          <w:lang w:val="en-US" w:eastAsia="en-US"/>
+        </w:rPr>
+        <w:t xml:space="preserve"> </w:t>
+      </w:r>
+      <w:r>
+        <w:rPr>
+          <w:sz w:val="32"/>
+          <w:szCs w:val="32"/>
+          <w:lang w:val="en-US"/>
+        </w:rPr>
+        <w:t>his selector selects all elements with class "box" that are descendants of the element having id="</w:t>
+      </w:r>
+      <w:proofErr w:type="spellStart"/>
+      <w:r>
+        <w:rPr>
+          <w:sz w:val="32"/>
+          <w:szCs w:val="32"/>
+          <w:lang w:val="en-US"/>
+        </w:rPr>
+        <w:t>container</w:t>
+      </w:r>
+      <w:proofErr w:type="gramStart"/>
+      <w:r>
+        <w:rPr>
+          <w:sz w:val="32"/>
+          <w:szCs w:val="32"/>
+          <w:lang w:val="en-US"/>
+        </w:rPr>
+        <w:t>".Both</w:t>
+      </w:r>
+      <w:proofErr w:type="spellEnd"/>
+      <w:proofErr w:type="gramEnd"/>
+      <w:r>
+        <w:rPr>
+          <w:sz w:val="32"/>
+          <w:szCs w:val="32"/>
+          <w:lang w:val="en-US"/>
+        </w:rPr>
+        <w:t xml:space="preserve"> Line 02 and Line 06 are inside the container.</w:t>
+      </w:r>
+    </w:p>
+    <w:p>
+      <w:pPr>
+        <w:pStyle w:val="ListParagraph"/>
+        <w:numPr>
+          <w:ilvl w:val="0"/>
+          <w:numId w:val="8"/>
+        </w:numPr>
+        <w:rPr>
+          <w:sz w:val="32"/>
+          <w:szCs w:val="32"/>
+          <w:lang w:val="en-US"/>
+        </w:rPr>
+      </w:pPr>
+      <w:r>
+        <w:rPr>
+          <w:sz w:val="32"/>
+          <w:szCs w:val="32"/>
+          <w:lang w:val="en-US"/>
+        </w:rPr>
+        <w:t>Line 10 is outside the container.</w:t>
+      </w:r>
+    </w:p>
+    <w:p>
+      <w:pPr>
+        <w:pStyle w:val="ListParagraph"/>
+        <w:numPr>
+          <w:ilvl w:val="0"/>
+          <w:numId w:val="8"/>
+        </w:numPr>
+        <w:rPr>
+          <w:sz w:val="32"/>
+          <w:szCs w:val="32"/>
+          <w:lang w:val="en-US"/>
+        </w:rPr>
+      </w:pPr>
+      <w:r>
+        <w:rPr>
+          <w:sz w:val="32"/>
+          <w:szCs w:val="32"/>
+          <w:lang w:val="en-US"/>
+        </w:rPr>
+        <w:lastRenderedPageBreak/>
+        <w:t>Other lines do not contain class "box".</w:t>
+      </w:r>
+    </w:p>
+    <w:p>
+      <w:pPr>
+        <w:rPr>
+          <w:sz w:val="32"/>
+          <w:szCs w:val="32"/>
+        </w:rPr>
+      </w:pPr>
+      <w:r>
+        <w:rPr>
+          <w:sz w:val="32"/>
+          <w:szCs w:val="32"/>
+          <w:lang w:val="en-US"/>
+        </w:rPr>
+        <w:t xml:space="preserve">Selector 6 - </w:t>
+      </w:r>
+      <w:r>
+        <w:rPr>
+          <w:sz w:val="32"/>
+          <w:szCs w:val="32"/>
+        </w:rPr>
+        <w:t xml:space="preserve">#container </w:t>
+      </w:r>
+      <w:proofErr w:type="gramStart"/>
+      <w:r>
+        <w:rPr>
+          <w:sz w:val="32"/>
+          <w:szCs w:val="32"/>
+        </w:rPr>
+        <w:t>&gt; .box</w:t>
+      </w:r>
+      <w:proofErr w:type="gramEnd"/>
+    </w:p>
+    <w:p>
+      <w:pPr>
+        <w:rPr>
+          <w:sz w:val="32"/>
+          <w:szCs w:val="32"/>
+          <w:lang w:val="en-US"/>
+        </w:rPr>
+      </w:pPr>
+      <w:r>
+        <w:rPr>
+          <w:sz w:val="32"/>
+          <w:szCs w:val="32"/>
+        </w:rPr>
+        <w:t xml:space="preserve">Explanation - </w:t>
+      </w:r>
+      <w:r>
+        <w:rPr>
+          <w:sz w:val="32"/>
+          <w:szCs w:val="32"/>
+          <w:lang w:val="en-US"/>
+        </w:rPr>
+        <w:t>It selects line number 02</w:t>
+      </w:r>
+      <w:r>
+        <w:rPr>
+          <w:sz w:val="32"/>
+          <w:szCs w:val="32"/>
+          <w:lang w:val="en-US"/>
+        </w:rPr>
+        <w:t xml:space="preserve"> a</w:t>
+      </w:r>
+      <w:r>
+        <w:rPr>
+          <w:sz w:val="32"/>
+          <w:szCs w:val="32"/>
+          <w:lang w:val="en-US"/>
+        </w:rPr>
+        <w:t xml:space="preserve">nd not any other because </w:t>
+      </w:r>
+      <w:r>
+        <w:rPr>
+          <w:sz w:val="32"/>
+          <w:szCs w:val="32"/>
+          <w:lang w:val="en-US"/>
+        </w:rPr>
+        <w:t>t</w:t>
+      </w:r>
+      <w:r>
+        <w:rPr>
+          <w:sz w:val="32"/>
+          <w:szCs w:val="32"/>
+          <w:lang w:val="en-US"/>
+        </w:rPr>
+        <w:t xml:space="preserve">he &gt; symbol selects only direct </w:t>
+      </w:r>
+      <w:proofErr w:type="spellStart"/>
+      <w:proofErr w:type="gramStart"/>
+      <w:r>
+        <w:rPr>
+          <w:sz w:val="32"/>
+          <w:szCs w:val="32"/>
+          <w:lang w:val="en-US"/>
+        </w:rPr>
+        <w:t>children.Line</w:t>
+      </w:r>
+      <w:proofErr w:type="spellEnd"/>
+      <w:proofErr w:type="gramEnd"/>
+      <w:r>
+        <w:rPr>
+          <w:sz w:val="32"/>
+          <w:szCs w:val="32"/>
+          <w:lang w:val="en-US"/>
+        </w:rPr>
+        <w:t xml:space="preserve"> 02 is a direct child of the container.</w:t>
+      </w:r>
+    </w:p>
+    <w:p>
+      <w:pPr>
+        <w:pStyle w:val="ListParagraph"/>
+        <w:numPr>
+          <w:ilvl w:val="0"/>
+          <w:numId w:val="9"/>
+        </w:numPr>
+        <w:rPr>
+          <w:sz w:val="32"/>
+          <w:szCs w:val="32"/>
+          <w:lang w:val="en-US"/>
+        </w:rPr>
+      </w:pPr>
+      <w:r>
+        <w:rPr>
+          <w:sz w:val="32"/>
+          <w:szCs w:val="32"/>
+          <w:lang w:val="en-US"/>
+        </w:rPr>
+        <w:t>Line 06 is not a direct child of container. It is inside another div (Line 05).</w:t>
+      </w:r>
+    </w:p>
+    <w:p>
+      <w:pPr>
+        <w:pStyle w:val="ListParagraph"/>
+        <w:numPr>
+          <w:ilvl w:val="0"/>
+          <w:numId w:val="9"/>
+        </w:numPr>
+        <w:rPr>
+          <w:sz w:val="32"/>
+          <w:szCs w:val="32"/>
+          <w:lang w:val="en-US"/>
+        </w:rPr>
+      </w:pPr>
+      <w:r>
+        <w:rPr>
+          <w:sz w:val="32"/>
+          <w:szCs w:val="32"/>
+          <w:lang w:val="en-US"/>
+        </w:rPr>
+        <w:t>Line 10 is outside the container.</w:t>
+      </w:r>
+    </w:p>
+    <w:p>
+      <w:pPr>
+        <w:pStyle w:val="ListParagraph"/>
+        <w:numPr>
+          <w:ilvl w:val="0"/>
+          <w:numId w:val="9"/>
+        </w:numPr>
+        <w:rPr>
+          <w:sz w:val="32"/>
+          <w:szCs w:val="32"/>
+          <w:lang w:val="en-US"/>
+        </w:rPr>
+      </w:pPr>
+      <w:r>
+        <w:rPr>
+          <w:sz w:val="32"/>
+          <w:szCs w:val="32"/>
+          <w:lang w:val="en-US"/>
+        </w:rPr>
+        <w:t>Other lines do not contain class "box".</w:t>
+      </w:r>
+    </w:p>
+    <w:p>
+      <w:pPr>
+        <w:rPr>
+          <w:sz w:val="32"/>
+          <w:szCs w:val="32"/>
+          <w:lang w:val="en-US"/>
+        </w:rPr>
+      </w:pPr>
+      <w:r>
+        <w:rPr>
+          <w:sz w:val="32"/>
+          <w:szCs w:val="32"/>
+          <w:lang w:val="en-US"/>
+        </w:rPr>
+        <w:t>Question 5:</w:t>
+      </w:r>
+    </w:p>
+    <w:p>
+      <w:pPr>
+        <w:rPr>
+          <w:sz w:val="32"/>
+          <w:szCs w:val="32"/>
+          <w:lang w:val="en-US"/>
+        </w:rPr>
+      </w:pPr>
+      <w:r>
+        <w:rPr>
+          <w:sz w:val="32"/>
+          <w:szCs w:val="32"/>
+          <w:lang w:val="en-US"/>
+        </w:rPr>
+        <w:t xml:space="preserve">Solution 1 – Using </w:t>
+      </w:r>
+      <w:proofErr w:type="spellStart"/>
+      <w:r>
+        <w:rPr>
+          <w:sz w:val="32"/>
+          <w:szCs w:val="32"/>
+          <w:lang w:val="en-US"/>
+        </w:rPr>
+        <w:t>FlexBox</w:t>
+      </w:r>
+      <w:proofErr w:type="spellEnd"/>
+    </w:p>
+    <w:p>
+      <w:pPr>
+        <w:rPr>
+          <w:sz w:val="32"/>
+          <w:szCs w:val="32"/>
+          <w:lang w:val="en-US"/>
+        </w:rPr>
+      </w:pPr>
+      <w:r>
+        <w:rPr>
+          <w:sz w:val="32"/>
+          <w:szCs w:val="32"/>
+          <w:lang w:val="en-US"/>
+        </w:rPr>
+        <w:t xml:space="preserve">HTML </w:t>
+      </w:r>
+    </w:p>
+    <w:p>
+      <w:pPr>
+        <w:rPr>
+          <w:sz w:val="32"/>
+          <w:szCs w:val="32"/>
+          <w:lang w:val="en-US"/>
+        </w:rPr>
+      </w:pPr>
+      <w:r>
+        <w:rPr>
+          <w:sz w:val="32"/>
+          <w:szCs w:val="32"/>
+          <w:lang w:val="en-US"/>
+        </w:rPr>
+        <w:t>&lt;div class="container"&gt;</w:t>
+      </w:r>
+    </w:p>
+    <w:p>
+      <w:pPr>
+        <w:rPr>
+          <w:sz w:val="32"/>
+          <w:szCs w:val="32"/>
+          <w:lang w:val="en-US"/>
+        </w:rPr>
+      </w:pPr>
+      <w:r>
+        <w:rPr>
+          <w:sz w:val="32"/>
+          <w:szCs w:val="32"/>
+          <w:lang w:val="en-US"/>
+        </w:rPr>
+        <w:t>  &lt;div class="left fixed box"&gt;Left&lt;/div&gt;</w:t>
+      </w:r>
+    </w:p>
+    <w:p>
+      <w:pPr>
+        <w:rPr>
+          <w:sz w:val="32"/>
+          <w:szCs w:val="32"/>
+          <w:lang w:val="en-US"/>
+        </w:rPr>
+      </w:pPr>
+      <w:r>
+        <w:rPr>
+          <w:sz w:val="32"/>
+          <w:szCs w:val="32"/>
+          <w:lang w:val="en-US"/>
+        </w:rPr>
+        <w:t>  &lt;div class="middle box"&gt;Middle&lt;/div&gt;</w:t>
+      </w:r>
+    </w:p>
+    <w:p>
+      <w:pPr>
+        <w:rPr>
+          <w:sz w:val="32"/>
+          <w:szCs w:val="32"/>
+          <w:lang w:val="en-US"/>
+        </w:rPr>
+      </w:pPr>
+      <w:r>
+        <w:rPr>
+          <w:sz w:val="32"/>
+          <w:szCs w:val="32"/>
+          <w:lang w:val="en-US"/>
+        </w:rPr>
+        <w:t>  &lt;div class="right fixed box"&gt;Right&lt;/div&gt;</w:t>
+      </w:r>
+    </w:p>
+    <w:p>
+      <w:pPr>
+        <w:rPr>
+          <w:sz w:val="32"/>
+          <w:szCs w:val="32"/>
+          <w:lang w:val="en-US"/>
+        </w:rPr>
+      </w:pPr>
+      <w:r>
+        <w:rPr>
+          <w:sz w:val="32"/>
+          <w:szCs w:val="32"/>
+          <w:lang w:val="en-US"/>
+        </w:rPr>
+        <w:t>&lt;/div&gt;</w:t>
+      </w:r>
+    </w:p>
+    <w:p>
+      <w:pPr>
+        <w:rPr>
+          <w:sz w:val="32"/>
+          <w:szCs w:val="32"/>
+          <w:lang w:val="en-US"/>
+        </w:rPr>
+      </w:pPr>
+    </w:p>
+    <w:p>
+      <w:pPr>
+        <w:rPr>
+          <w:sz w:val="32"/>
+          <w:szCs w:val="32"/>
+          <w:lang w:val="en-US"/>
+        </w:rPr>
+      </w:pPr>
+      <w:r>
+        <w:rPr>
+          <w:sz w:val="32"/>
+          <w:szCs w:val="32"/>
+          <w:lang w:val="en-US"/>
+        </w:rPr>
+        <w:t>CSS</w:t>
+      </w:r>
+    </w:p>
+    <w:p>
+      <w:pPr>
+        <w:rPr>
+          <w:sz w:val="32"/>
+          <w:szCs w:val="32"/>
+          <w:lang w:val="en-US"/>
+        </w:rPr>
+      </w:pPr>
+      <w:r>
+        <w:rPr>
+          <w:sz w:val="32"/>
+          <w:szCs w:val="32"/>
+          <w:lang w:val="en-US"/>
+        </w:rPr>
+        <w:t>.container {</w:t>
+      </w:r>
+    </w:p>
+    <w:p>
+      <w:pPr>
+        <w:rPr>
+          <w:sz w:val="32"/>
+          <w:szCs w:val="32"/>
+          <w:lang w:val="en-US"/>
+        </w:rPr>
+      </w:pPr>
+      <w:r>
+        <w:rPr>
+          <w:sz w:val="32"/>
+          <w:szCs w:val="32"/>
+          <w:lang w:val="en-US"/>
+        </w:rPr>
+        <w:t>  display: flex;</w:t>
+      </w:r>
+    </w:p>
+    <w:p>
+      <w:pPr>
+        <w:rPr>
+          <w:sz w:val="32"/>
+          <w:szCs w:val="32"/>
+          <w:lang w:val="en-US"/>
+        </w:rPr>
+      </w:pPr>
+      <w:r>
+        <w:rPr>
+          <w:sz w:val="32"/>
+          <w:szCs w:val="32"/>
+          <w:lang w:val="en-US"/>
+        </w:rPr>
+        <w:t>  width: 100%;</w:t>
+      </w:r>
+    </w:p>
+    <w:p>
+      <w:pPr>
+        <w:rPr>
+          <w:sz w:val="32"/>
+          <w:szCs w:val="32"/>
+          <w:lang w:val="en-US"/>
+        </w:rPr>
+      </w:pPr>
+      <w:r>
+        <w:rPr>
+          <w:sz w:val="32"/>
+          <w:szCs w:val="32"/>
+          <w:lang w:val="en-US"/>
+        </w:rPr>
+        <w:t>}</w:t>
+      </w:r>
+    </w:p>
+    <w:p>
+      <w:pPr>
+        <w:rPr>
+          <w:sz w:val="32"/>
+          <w:szCs w:val="32"/>
+          <w:lang w:val="en-US"/>
+        </w:rPr>
+      </w:pPr>
+      <w:proofErr w:type="gramStart"/>
+      <w:r>
+        <w:rPr>
+          <w:sz w:val="32"/>
+          <w:szCs w:val="32"/>
+          <w:lang w:val="en-US"/>
+        </w:rPr>
+        <w:t>.left</w:t>
+      </w:r>
+      <w:proofErr w:type="gramEnd"/>
+      <w:r>
+        <w:rPr>
+          <w:sz w:val="32"/>
+          <w:szCs w:val="32"/>
+          <w:lang w:val="en-US"/>
+        </w:rPr>
+        <w:t>,</w:t>
+      </w:r>
+    </w:p>
+    <w:p>
+      <w:pPr>
+        <w:rPr>
+          <w:sz w:val="32"/>
+          <w:szCs w:val="32"/>
+          <w:lang w:val="en-US"/>
+        </w:rPr>
+      </w:pPr>
+      <w:proofErr w:type="gramStart"/>
+      <w:r>
+        <w:rPr>
+          <w:sz w:val="32"/>
+          <w:szCs w:val="32"/>
+          <w:lang w:val="en-US"/>
+        </w:rPr>
+        <w:t>.right</w:t>
+      </w:r>
+      <w:proofErr w:type="gramEnd"/>
+      <w:r>
+        <w:rPr>
+          <w:sz w:val="32"/>
+          <w:szCs w:val="32"/>
+          <w:lang w:val="en-US"/>
+        </w:rPr>
+        <w:t xml:space="preserve"> {</w:t>
+      </w:r>
+    </w:p>
+    <w:p>
+      <w:pPr>
+        <w:rPr>
+          <w:sz w:val="32"/>
+          <w:szCs w:val="32"/>
+          <w:lang w:val="en-US"/>
+        </w:rPr>
+      </w:pPr>
+      <w:r>
+        <w:rPr>
+          <w:sz w:val="32"/>
+          <w:szCs w:val="32"/>
+          <w:lang w:val="en-US"/>
+        </w:rPr>
+        <w:t>  width: 100px;</w:t>
+      </w:r>
+    </w:p>
+    <w:p>
+      <w:pPr>
+        <w:rPr>
+          <w:sz w:val="32"/>
+          <w:szCs w:val="32"/>
+          <w:lang w:val="en-US"/>
+        </w:rPr>
+      </w:pPr>
+      <w:r>
+        <w:rPr>
+          <w:sz w:val="32"/>
+          <w:szCs w:val="32"/>
+          <w:lang w:val="en-US"/>
+        </w:rPr>
+        <w:t>  flex-shrink: 0;</w:t>
+      </w:r>
+    </w:p>
+    <w:p>
+      <w:pPr>
+        <w:rPr>
+          <w:sz w:val="32"/>
+          <w:szCs w:val="32"/>
+          <w:lang w:val="en-US"/>
+        </w:rPr>
+      </w:pPr>
+      <w:r>
+        <w:rPr>
+          <w:sz w:val="32"/>
+          <w:szCs w:val="32"/>
+          <w:lang w:val="en-US"/>
+        </w:rPr>
+        <w:t>}</w:t>
+      </w:r>
+    </w:p>
+    <w:p>
+      <w:pPr>
+        <w:rPr>
+          <w:sz w:val="32"/>
+          <w:szCs w:val="32"/>
+          <w:lang w:val="en-US"/>
+        </w:rPr>
+      </w:pPr>
+      <w:proofErr w:type="gramStart"/>
+      <w:r>
+        <w:rPr>
+          <w:sz w:val="32"/>
+          <w:szCs w:val="32"/>
+          <w:lang w:val="en-US"/>
+        </w:rPr>
+        <w:t>.middle</w:t>
+      </w:r>
+      <w:proofErr w:type="gramEnd"/>
+      <w:r>
+        <w:rPr>
+          <w:sz w:val="32"/>
+          <w:szCs w:val="32"/>
+          <w:lang w:val="en-US"/>
+        </w:rPr>
+        <w:t xml:space="preserve"> {</w:t>
+      </w:r>
+    </w:p>
+    <w:p>
+      <w:pPr>
+        <w:rPr>
+          <w:sz w:val="32"/>
+          <w:szCs w:val="32"/>
+          <w:lang w:val="en-US"/>
+        </w:rPr>
+      </w:pPr>
+      <w:r>
+        <w:rPr>
+          <w:sz w:val="32"/>
+          <w:szCs w:val="32"/>
+          <w:lang w:val="en-US"/>
+        </w:rPr>
+        <w:t>  flex: 1;</w:t>
+      </w:r>
+    </w:p>
+    <w:p>
+      <w:pPr>
+        <w:rPr>
+          <w:sz w:val="32"/>
+          <w:szCs w:val="32"/>
+          <w:lang w:val="en-US"/>
+        </w:rPr>
+      </w:pPr>
+      <w:r>
+        <w:rPr>
+          <w:sz w:val="32"/>
+          <w:szCs w:val="32"/>
+          <w:lang w:val="en-US"/>
+        </w:rPr>
+        <w:lastRenderedPageBreak/>
+        <w:t>}</w:t>
+      </w:r>
+    </w:p>
+    <w:p>
+      <w:pPr>
+        <w:rPr>
+          <w:sz w:val="32"/>
+          <w:szCs w:val="32"/>
+          <w:lang w:val="en-US"/>
+        </w:rPr>
+      </w:pPr>
+    </w:p>
+    <w:p>
+      <w:pPr>
+        <w:rPr>
+          <w:sz w:val="32"/>
+          <w:szCs w:val="32"/>
+          <w:lang w:val="en-US"/>
+        </w:rPr>
+      </w:pPr>
+      <w:r>
+        <w:rPr>
+          <w:sz w:val="32"/>
+          <w:szCs w:val="32"/>
+          <w:lang w:val="en-US"/>
+        </w:rPr>
+        <w:t xml:space="preserve">Explanation – </w:t>
+      </w:r>
+    </w:p>
+    <w:p>
+      <w:pPr>
+        <w:pStyle w:val="ListParagraph"/>
+        <w:numPr>
+          <w:ilvl w:val="0"/>
+          <w:numId w:val="10"/>
+        </w:numPr>
+        <w:rPr>
+          <w:sz w:val="32"/>
+          <w:szCs w:val="32"/>
+          <w:lang w:val="en-US"/>
+        </w:rPr>
+      </w:pPr>
+      <w:r>
+        <w:rPr>
+          <w:sz w:val="32"/>
+          <w:szCs w:val="32"/>
+          <w:lang w:val="en-US"/>
+        </w:rPr>
+        <w:t>display: flex places all child elements in a horizontal row.</w:t>
+      </w:r>
+    </w:p>
+    <w:p>
+      <w:pPr>
+        <w:pStyle w:val="ListParagraph"/>
+        <w:numPr>
+          <w:ilvl w:val="0"/>
+          <w:numId w:val="10"/>
+        </w:numPr>
+        <w:rPr>
+          <w:sz w:val="32"/>
+          <w:szCs w:val="32"/>
+          <w:lang w:val="en-US"/>
+        </w:rPr>
+      </w:pPr>
+      <w:r>
+        <w:rPr>
+          <w:sz w:val="32"/>
+          <w:szCs w:val="32"/>
+          <w:lang w:val="en-US"/>
+        </w:rPr>
+        <w:t>The left and right boxes are given a fixed width of 100px.</w:t>
+      </w:r>
+    </w:p>
+    <w:p>
+      <w:pPr>
+        <w:pStyle w:val="ListParagraph"/>
+        <w:numPr>
+          <w:ilvl w:val="0"/>
+          <w:numId w:val="10"/>
+        </w:numPr>
+        <w:rPr>
+          <w:sz w:val="32"/>
+          <w:szCs w:val="32"/>
+          <w:lang w:val="en-US"/>
+        </w:rPr>
+      </w:pPr>
+      <w:r>
+        <w:rPr>
+          <w:sz w:val="32"/>
+          <w:szCs w:val="32"/>
+          <w:lang w:val="en-US"/>
+        </w:rPr>
+        <w:t>flex: 1 allows the middle box to occupy all remaining space.</w:t>
+      </w:r>
+    </w:p>
+    <w:p>
+      <w:pPr>
+        <w:pStyle w:val="ListParagraph"/>
+        <w:numPr>
+          <w:ilvl w:val="0"/>
+          <w:numId w:val="10"/>
+        </w:numPr>
+        <w:rPr>
+          <w:sz w:val="32"/>
+          <w:szCs w:val="32"/>
+          <w:lang w:val="en-US"/>
+        </w:rPr>
+      </w:pPr>
+      <w:r>
+        <w:rPr>
+          <w:sz w:val="32"/>
+          <w:szCs w:val="32"/>
+          <w:lang w:val="en-US"/>
+        </w:rPr>
+        <w:t>flex-shrink: 0 prevents the fixed-width boxes from shrinking.</w:t>
+      </w:r>
+    </w:p>
+    <w:p>
+      <w:pPr>
+        <w:rPr>
+          <w:sz w:val="32"/>
+          <w:szCs w:val="32"/>
+          <w:lang w:val="en-US"/>
+        </w:rPr>
+      </w:pPr>
+      <w:r>
+        <w:rPr>
+          <w:sz w:val="32"/>
+          <w:szCs w:val="32"/>
+          <w:lang w:val="en-US"/>
+        </w:rPr>
+        <w:t>Solution 2 – Using CSS Grid</w:t>
+      </w:r>
+    </w:p>
+    <w:p>
+      <w:pPr>
+        <w:rPr>
+          <w:sz w:val="32"/>
+          <w:szCs w:val="32"/>
+          <w:lang w:val="en-US"/>
+        </w:rPr>
+      </w:pPr>
+      <w:r>
+        <w:rPr>
+          <w:sz w:val="32"/>
+          <w:szCs w:val="32"/>
+          <w:lang w:val="en-US"/>
+        </w:rPr>
+        <w:t>HTML</w:t>
+      </w:r>
+    </w:p>
+    <w:p>
+      <w:pPr>
+        <w:rPr>
+          <w:sz w:val="32"/>
+          <w:szCs w:val="32"/>
+          <w:lang w:val="en-US"/>
+        </w:rPr>
+      </w:pPr>
+      <w:r>
+        <w:rPr>
+          <w:sz w:val="32"/>
+          <w:szCs w:val="32"/>
+          <w:lang w:val="en-US"/>
+        </w:rPr>
+        <w:t>&lt;div class="container"&gt;</w:t>
+      </w:r>
+    </w:p>
+    <w:p>
+      <w:pPr>
+        <w:rPr>
+          <w:sz w:val="32"/>
+          <w:szCs w:val="32"/>
+          <w:lang w:val="en-US"/>
+        </w:rPr>
+      </w:pPr>
+      <w:r>
+        <w:rPr>
+          <w:sz w:val="32"/>
+          <w:szCs w:val="32"/>
+          <w:lang w:val="en-US"/>
+        </w:rPr>
+        <w:t>  &lt;div class="left fixed box"&gt;Left&lt;/div&gt;</w:t>
+      </w:r>
+    </w:p>
+    <w:p>
+      <w:pPr>
+        <w:rPr>
+          <w:sz w:val="32"/>
+          <w:szCs w:val="32"/>
+          <w:lang w:val="en-US"/>
+        </w:rPr>
+      </w:pPr>
+      <w:r>
+        <w:rPr>
+          <w:sz w:val="32"/>
+          <w:szCs w:val="32"/>
+          <w:lang w:val="en-US"/>
+        </w:rPr>
+        <w:t>  &lt;div class="middle box"&gt;Middle&lt;/div&gt;</w:t>
+      </w:r>
+    </w:p>
+    <w:p>
+      <w:pPr>
+        <w:rPr>
+          <w:sz w:val="32"/>
+          <w:szCs w:val="32"/>
+          <w:lang w:val="en-US"/>
+        </w:rPr>
+      </w:pPr>
+      <w:r>
+        <w:rPr>
+          <w:sz w:val="32"/>
+          <w:szCs w:val="32"/>
+          <w:lang w:val="en-US"/>
+        </w:rPr>
+        <w:t>  &lt;div class="right fixed box"&gt;Right&lt;/div&gt;</w:t>
+      </w:r>
+    </w:p>
+    <w:p>
+      <w:pPr>
+        <w:rPr>
+          <w:sz w:val="32"/>
+          <w:szCs w:val="32"/>
+          <w:lang w:val="en-US"/>
+        </w:rPr>
+      </w:pPr>
+      <w:r>
+        <w:rPr>
+          <w:sz w:val="32"/>
+          <w:szCs w:val="32"/>
+          <w:lang w:val="en-US"/>
+        </w:rPr>
+        <w:t>&lt;/div&gt;</w:t>
+      </w:r>
+    </w:p>
+    <w:p>
+      <w:pPr>
+        <w:rPr>
+          <w:sz w:val="32"/>
+          <w:szCs w:val="32"/>
+          <w:lang w:val="en-US"/>
+        </w:rPr>
+      </w:pPr>
+    </w:p>
+    <w:p>
+      <w:pPr>
+        <w:rPr>
+          <w:sz w:val="32"/>
+          <w:szCs w:val="32"/>
+          <w:lang w:val="en-US"/>
+        </w:rPr>
+      </w:pPr>
+      <w:r>
+        <w:rPr>
+          <w:sz w:val="32"/>
+          <w:szCs w:val="32"/>
+          <w:lang w:val="en-US"/>
+        </w:rPr>
+        <w:t>CSS</w:t>
+      </w:r>
+    </w:p>
+    <w:p>
+      <w:pPr>
+        <w:rPr>
+          <w:sz w:val="32"/>
+          <w:szCs w:val="32"/>
+          <w:lang w:val="en-US"/>
+        </w:rPr>
+      </w:pPr>
+      <w:r>
+        <w:rPr>
+          <w:sz w:val="32"/>
+          <w:szCs w:val="32"/>
+          <w:lang w:val="en-US"/>
+        </w:rPr>
+        <w:t>.container {</w:t>
+      </w:r>
+    </w:p>
+    <w:p>
+      <w:pPr>
+        <w:rPr>
+          <w:sz w:val="32"/>
+          <w:szCs w:val="32"/>
+          <w:lang w:val="en-US"/>
+        </w:rPr>
+      </w:pPr>
+      <w:r>
+        <w:rPr>
+          <w:sz w:val="32"/>
+          <w:szCs w:val="32"/>
+          <w:lang w:val="en-US"/>
+        </w:rPr>
+        <w:t>  display: grid;</w:t>
+      </w:r>
+    </w:p>
+    <w:p>
+      <w:pPr>
+        <w:rPr>
+          <w:sz w:val="32"/>
+          <w:szCs w:val="32"/>
+          <w:lang w:val="en-US"/>
+        </w:rPr>
+      </w:pPr>
+      <w:r>
+        <w:rPr>
+          <w:sz w:val="32"/>
+          <w:szCs w:val="32"/>
+          <w:lang w:val="en-US"/>
+        </w:rPr>
+        <w:t>  grid-template-columns: 100px 1fr 100px;</w:t>
+      </w:r>
+    </w:p>
+    <w:p>
+      <w:pPr>
+        <w:rPr>
+          <w:sz w:val="32"/>
+          <w:szCs w:val="32"/>
+          <w:lang w:val="en-US"/>
+        </w:rPr>
+      </w:pPr>
+      <w:r>
+        <w:rPr>
+          <w:sz w:val="32"/>
+          <w:szCs w:val="32"/>
+          <w:lang w:val="en-US"/>
+        </w:rPr>
+        <w:t>  width: 100%;</w:t>
+      </w:r>
+    </w:p>
+    <w:p>
+      <w:pPr>
+        <w:rPr>
+          <w:sz w:val="32"/>
+          <w:szCs w:val="32"/>
+          <w:lang w:val="en-US"/>
+        </w:rPr>
+      </w:pPr>
+      <w:r>
+        <w:rPr>
+          <w:sz w:val="32"/>
+          <w:szCs w:val="32"/>
+          <w:lang w:val="en-US"/>
+        </w:rPr>
+        <w:t>}</w:t>
+      </w:r>
+    </w:p>
+    <w:p>
+      <w:pPr>
+        <w:rPr>
+          <w:sz w:val="32"/>
+          <w:szCs w:val="32"/>
+          <w:lang w:val="en-US"/>
+        </w:rPr>
+      </w:pPr>
+    </w:p>
+    <w:p>
+      <w:pPr>
+        <w:rPr>
+          <w:sz w:val="32"/>
+          <w:szCs w:val="32"/>
+          <w:lang w:val="en-US"/>
+        </w:rPr>
+      </w:pPr>
+      <w:r>
+        <w:rPr>
+          <w:sz w:val="32"/>
+          <w:szCs w:val="32"/>
+          <w:lang w:val="en-US"/>
+        </w:rPr>
+        <w:t xml:space="preserve">Explanation – </w:t>
+      </w:r>
+    </w:p>
+    <w:p>
+      <w:pPr>
+        <w:pStyle w:val="ListParagraph"/>
+        <w:numPr>
+          <w:ilvl w:val="0"/>
+          <w:numId w:val="11"/>
+        </w:numPr>
+        <w:rPr>
+          <w:sz w:val="32"/>
+          <w:szCs w:val="32"/>
+          <w:lang w:val="en-US"/>
+        </w:rPr>
+      </w:pPr>
+      <w:r>
+        <w:rPr>
+          <w:sz w:val="32"/>
+          <w:szCs w:val="32"/>
+          <w:lang w:val="en-US"/>
+        </w:rPr>
+        <w:t>CSS Grid creates three columns.</w:t>
+      </w:r>
+    </w:p>
+    <w:p>
+      <w:pPr>
+        <w:pStyle w:val="ListParagraph"/>
+        <w:numPr>
+          <w:ilvl w:val="0"/>
+          <w:numId w:val="11"/>
+        </w:numPr>
+        <w:rPr>
+          <w:sz w:val="32"/>
+          <w:szCs w:val="32"/>
+          <w:lang w:val="en-US"/>
+        </w:rPr>
+      </w:pPr>
+      <w:r>
+        <w:rPr>
+          <w:sz w:val="32"/>
+          <w:szCs w:val="32"/>
+          <w:lang w:val="en-US"/>
+        </w:rPr>
+        <w:t>The first column has a fixed width of 100px.</w:t>
+      </w:r>
+    </w:p>
+    <w:p>
+      <w:pPr>
+        <w:pStyle w:val="ListParagraph"/>
+        <w:numPr>
+          <w:ilvl w:val="0"/>
+          <w:numId w:val="11"/>
+        </w:numPr>
+        <w:rPr>
+          <w:sz w:val="32"/>
+          <w:szCs w:val="32"/>
+          <w:lang w:val="en-US"/>
+        </w:rPr>
+      </w:pPr>
+      <w:r>
+        <w:rPr>
+          <w:sz w:val="32"/>
+          <w:szCs w:val="32"/>
+          <w:lang w:val="en-US"/>
+        </w:rPr>
+        <w:t>The third column also has a fixed width of 100px.</w:t>
+      </w:r>
+    </w:p>
+    <w:p>
+      <w:pPr>
+        <w:pStyle w:val="ListParagraph"/>
+        <w:numPr>
+          <w:ilvl w:val="0"/>
+          <w:numId w:val="11"/>
+        </w:numPr>
+        <w:rPr>
+          <w:sz w:val="32"/>
+          <w:szCs w:val="32"/>
+          <w:lang w:val="en-US"/>
+        </w:rPr>
+      </w:pPr>
+      <w:r>
+        <w:rPr>
+          <w:sz w:val="32"/>
+          <w:szCs w:val="32"/>
+          <w:lang w:val="en-US"/>
+        </w:rPr>
+        <w:t>The middle column uses 1fr, which means it occupies the remaining available space.</w:t>
+      </w:r>
+    </w:p>
+    <w:p>
+      <w:pPr>
+        <w:pStyle w:val="ListParagraph"/>
+        <w:numPr>
+          <w:ilvl w:val="0"/>
+          <w:numId w:val="11"/>
+        </w:numPr>
+        <w:rPr>
+          <w:sz w:val="32"/>
+          <w:szCs w:val="32"/>
+          <w:lang w:val="en-US"/>
+        </w:rPr>
+      </w:pPr>
+      <w:r>
+        <w:rPr>
+          <w:sz w:val="32"/>
+          <w:szCs w:val="32"/>
+          <w:lang w:val="en-US"/>
+        </w:rPr>
+        <w:t>The layout automatically adjusts when the container width changes.</w:t>
+      </w:r>
+    </w:p>
+    <w:p>
+      <w:pPr>
+        <w:rPr>
+          <w:sz w:val="32"/>
+          <w:szCs w:val="32"/>
+          <w:lang w:val="en-US"/>
+        </w:rPr>
+      </w:pPr>
+      <w:r>
+        <w:rPr>
+          <w:sz w:val="32"/>
+          <w:szCs w:val="32"/>
+          <w:lang w:val="en-US"/>
+        </w:rPr>
+        <w:lastRenderedPageBreak/>
+        <w:t>Solution 3 – Using Float</w:t>
+      </w:r>
+    </w:p>
+    <w:p>
+      <w:pPr>
+        <w:rPr>
+          <w:sz w:val="32"/>
+          <w:szCs w:val="32"/>
+          <w:lang w:val="en-US"/>
+        </w:rPr>
+      </w:pPr>
+      <w:r>
+        <w:rPr>
+          <w:sz w:val="32"/>
+          <w:szCs w:val="32"/>
+          <w:lang w:val="en-US"/>
+        </w:rPr>
+        <w:t>HTML</w:t>
+      </w:r>
+    </w:p>
+    <w:p>
+      <w:pPr>
+        <w:rPr>
+          <w:sz w:val="32"/>
+          <w:szCs w:val="32"/>
+          <w:lang w:val="en-US"/>
+        </w:rPr>
+      </w:pPr>
+      <w:r>
+        <w:rPr>
+          <w:sz w:val="32"/>
+          <w:szCs w:val="32"/>
+          <w:lang w:val="en-US"/>
+        </w:rPr>
+        <w:t>&lt;div class="container"&gt;</w:t>
+      </w:r>
+    </w:p>
+    <w:p>
+      <w:pPr>
+        <w:rPr>
+          <w:sz w:val="32"/>
+          <w:szCs w:val="32"/>
+          <w:lang w:val="en-US"/>
+        </w:rPr>
+      </w:pPr>
+      <w:r>
+        <w:rPr>
+          <w:sz w:val="32"/>
+          <w:szCs w:val="32"/>
+          <w:lang w:val="en-US"/>
+        </w:rPr>
+        <w:t>  &lt;div class="left box"&gt;Left&lt;/div&gt;</w:t>
+      </w:r>
+    </w:p>
+    <w:p>
+      <w:pPr>
+        <w:rPr>
+          <w:sz w:val="32"/>
+          <w:szCs w:val="32"/>
+          <w:lang w:val="en-US"/>
+        </w:rPr>
+      </w:pPr>
+      <w:r>
+        <w:rPr>
+          <w:sz w:val="32"/>
+          <w:szCs w:val="32"/>
+          <w:lang w:val="en-US"/>
+        </w:rPr>
+        <w:t>  &lt;div class="right box"&gt;Right&lt;/div&gt;</w:t>
+      </w:r>
+    </w:p>
+    <w:p>
+      <w:pPr>
+        <w:rPr>
+          <w:sz w:val="32"/>
+          <w:szCs w:val="32"/>
+          <w:lang w:val="en-US"/>
+        </w:rPr>
+      </w:pPr>
+      <w:r>
+        <w:rPr>
+          <w:sz w:val="32"/>
+          <w:szCs w:val="32"/>
+          <w:lang w:val="en-US"/>
+        </w:rPr>
+        <w:t>  &lt;div class="middle box"&gt;Middle&lt;/div&gt;</w:t>
+      </w:r>
+    </w:p>
+    <w:p>
+      <w:pPr>
+        <w:rPr>
+          <w:sz w:val="32"/>
+          <w:szCs w:val="32"/>
+          <w:lang w:val="en-US"/>
+        </w:rPr>
+      </w:pPr>
+      <w:r>
+        <w:rPr>
+          <w:sz w:val="32"/>
+          <w:szCs w:val="32"/>
+          <w:lang w:val="en-US"/>
+        </w:rPr>
+        <w:t>&lt;/div&gt;</w:t>
+      </w:r>
+    </w:p>
+    <w:p>
+      <w:pPr>
+        <w:rPr>
+          <w:sz w:val="32"/>
+          <w:szCs w:val="32"/>
+          <w:lang w:val="en-US"/>
+        </w:rPr>
+      </w:pPr>
+    </w:p>
+    <w:p>
+      <w:pPr>
+        <w:rPr>
+          <w:sz w:val="32"/>
+          <w:szCs w:val="32"/>
+          <w:lang w:val="en-US"/>
+        </w:rPr>
+      </w:pPr>
+      <w:r>
+        <w:rPr>
+          <w:sz w:val="32"/>
+          <w:szCs w:val="32"/>
+          <w:lang w:val="en-US"/>
+        </w:rPr>
+        <w:t>CSS</w:t>
+      </w:r>
+      <w:r>
+        <w:rPr>
+          <w:sz w:val="32"/>
+          <w:szCs w:val="32"/>
+          <w:lang w:val="en-US"/>
+        </w:rPr>
+        <w:br/>
+      </w:r>
+      <w:r>
+        <w:rPr>
+          <w:sz w:val="32"/>
+          <w:szCs w:val="32"/>
+          <w:lang w:val="en-US"/>
+        </w:rPr>
+        <w:t>.left {</w:t>
+      </w:r>
+    </w:p>
+    <w:p>
+      <w:pPr>
+        <w:rPr>
+          <w:sz w:val="32"/>
+          <w:szCs w:val="32"/>
+          <w:lang w:val="en-US"/>
+        </w:rPr>
+      </w:pPr>
+      <w:r>
+        <w:rPr>
+          <w:sz w:val="32"/>
+          <w:szCs w:val="32"/>
+          <w:lang w:val="en-US"/>
+        </w:rPr>
+        <w:t>  float: left;</w:t>
+      </w:r>
+    </w:p>
+    <w:p>
+      <w:pPr>
+        <w:rPr>
+          <w:sz w:val="32"/>
+          <w:szCs w:val="32"/>
+          <w:lang w:val="en-US"/>
+        </w:rPr>
+      </w:pPr>
+      <w:r>
+        <w:rPr>
+          <w:sz w:val="32"/>
+          <w:szCs w:val="32"/>
+          <w:lang w:val="en-US"/>
+        </w:rPr>
+        <w:t>  width: 100px;</w:t>
+      </w:r>
+    </w:p>
+    <w:p>
+      <w:pPr>
+        <w:rPr>
+          <w:sz w:val="32"/>
+          <w:szCs w:val="32"/>
+          <w:lang w:val="en-US"/>
+        </w:rPr>
+      </w:pPr>
+      <w:r>
+        <w:rPr>
+          <w:sz w:val="32"/>
+          <w:szCs w:val="32"/>
+          <w:lang w:val="en-US"/>
+        </w:rPr>
+        <w:t>}</w:t>
+      </w:r>
+    </w:p>
+    <w:p>
+      <w:pPr>
+        <w:rPr>
+          <w:sz w:val="32"/>
+          <w:szCs w:val="32"/>
+          <w:lang w:val="en-US"/>
+        </w:rPr>
+      </w:pPr>
+      <w:proofErr w:type="gramStart"/>
+      <w:r>
+        <w:rPr>
+          <w:sz w:val="32"/>
+          <w:szCs w:val="32"/>
+          <w:lang w:val="en-US"/>
+        </w:rPr>
+        <w:t>.right</w:t>
+      </w:r>
+      <w:proofErr w:type="gramEnd"/>
+      <w:r>
+        <w:rPr>
+          <w:sz w:val="32"/>
+          <w:szCs w:val="32"/>
+          <w:lang w:val="en-US"/>
+        </w:rPr>
+        <w:t xml:space="preserve"> {</w:t>
+      </w:r>
+    </w:p>
+    <w:p>
+      <w:pPr>
+        <w:rPr>
+          <w:sz w:val="32"/>
+          <w:szCs w:val="32"/>
+          <w:lang w:val="en-US"/>
+        </w:rPr>
+      </w:pPr>
+      <w:r>
+        <w:rPr>
+          <w:sz w:val="32"/>
+          <w:szCs w:val="32"/>
+          <w:lang w:val="en-US"/>
+        </w:rPr>
+        <w:t>  float: right;</w:t>
+      </w:r>
+    </w:p>
+    <w:p>
+      <w:pPr>
+        <w:rPr>
+          <w:sz w:val="32"/>
+          <w:szCs w:val="32"/>
+          <w:lang w:val="en-US"/>
+        </w:rPr>
+      </w:pPr>
+      <w:r>
+        <w:rPr>
+          <w:sz w:val="32"/>
+          <w:szCs w:val="32"/>
+          <w:lang w:val="en-US"/>
+        </w:rPr>
+        <w:t>  width: 100px;</w:t>
+      </w:r>
+    </w:p>
+    <w:p>
+      <w:pPr>
+        <w:rPr>
+          <w:sz w:val="32"/>
+          <w:szCs w:val="32"/>
+          <w:lang w:val="en-US"/>
+        </w:rPr>
+      </w:pPr>
+      <w:r>
+        <w:rPr>
+          <w:sz w:val="32"/>
+          <w:szCs w:val="32"/>
+          <w:lang w:val="en-US"/>
+        </w:rPr>
+        <w:t>}</w:t>
+      </w:r>
+    </w:p>
+    <w:p>
+      <w:pPr>
+        <w:rPr>
+          <w:sz w:val="32"/>
+          <w:szCs w:val="32"/>
+          <w:lang w:val="en-US"/>
+        </w:rPr>
+      </w:pPr>
+      <w:proofErr w:type="gramStart"/>
+      <w:r>
+        <w:rPr>
+          <w:sz w:val="32"/>
+          <w:szCs w:val="32"/>
+          <w:lang w:val="en-US"/>
+        </w:rPr>
+        <w:t>.middle</w:t>
+      </w:r>
+      <w:proofErr w:type="gramEnd"/>
+      <w:r>
+        <w:rPr>
+          <w:sz w:val="32"/>
+          <w:szCs w:val="32"/>
+          <w:lang w:val="en-US"/>
+        </w:rPr>
+        <w:t xml:space="preserve"> {</w:t>
+      </w:r>
+    </w:p>
+    <w:p>
+      <w:pPr>
+        <w:rPr>
+          <w:sz w:val="32"/>
+          <w:szCs w:val="32"/>
+          <w:lang w:val="en-US"/>
+        </w:rPr>
+      </w:pPr>
+      <w:r>
+        <w:rPr>
+          <w:sz w:val="32"/>
+          <w:szCs w:val="32"/>
+          <w:lang w:val="en-US"/>
+        </w:rPr>
+        <w:t>  margin-left: 100px;</w:t>
+      </w:r>
+    </w:p>
+    <w:p>
+      <w:pPr>
+        <w:rPr>
+          <w:sz w:val="32"/>
+          <w:szCs w:val="32"/>
+          <w:lang w:val="en-US"/>
+        </w:rPr>
+      </w:pPr>
+      <w:r>
+        <w:rPr>
+          <w:sz w:val="32"/>
+          <w:szCs w:val="32"/>
+          <w:lang w:val="en-US"/>
+        </w:rPr>
+        <w:t>  margin-right: 100px;</w:t>
+      </w:r>
+    </w:p>
+    <w:p>
+      <w:pPr>
+        <w:rPr>
+          <w:sz w:val="32"/>
+          <w:szCs w:val="32"/>
+          <w:lang w:val="en-US"/>
+        </w:rPr>
+      </w:pPr>
+      <w:r>
+        <w:rPr>
+          <w:sz w:val="32"/>
+          <w:szCs w:val="32"/>
+          <w:lang w:val="en-US"/>
+        </w:rPr>
+        <w:t>}</w:t>
+      </w:r>
+    </w:p>
+    <w:p>
+      <w:pPr>
+        <w:rPr>
+          <w:sz w:val="32"/>
+          <w:szCs w:val="32"/>
+          <w:lang w:val="en-US"/>
+        </w:rPr>
+      </w:pPr>
+    </w:p>
+    <w:p>
+      <w:pPr>
+        <w:rPr>
+          <w:sz w:val="32"/>
+          <w:szCs w:val="32"/>
+          <w:lang w:val="en-US"/>
+        </w:rPr>
+      </w:pPr>
+      <w:r>
+        <w:rPr>
+          <w:sz w:val="32"/>
+          <w:szCs w:val="32"/>
+          <w:lang w:val="en-US"/>
+        </w:rPr>
+        <w:t xml:space="preserve">Explanation – </w:t>
+      </w:r>
+    </w:p>
+    <w:p>
+      <w:pPr>
+        <w:pStyle w:val="ListParagraph"/>
+        <w:numPr>
+          <w:ilvl w:val="0"/>
+          <w:numId w:val="12"/>
+        </w:numPr>
+        <w:rPr>
+          <w:sz w:val="32"/>
+          <w:szCs w:val="32"/>
+          <w:lang w:val="en-US"/>
+        </w:rPr>
+      </w:pPr>
+      <w:r>
+        <w:rPr>
+          <w:sz w:val="32"/>
+          <w:szCs w:val="32"/>
+          <w:lang w:val="en-US"/>
+        </w:rPr>
+        <w:t>The left box is floated to the left.</w:t>
+      </w:r>
+    </w:p>
+    <w:p>
+      <w:pPr>
+        <w:pStyle w:val="ListParagraph"/>
+        <w:numPr>
+          <w:ilvl w:val="0"/>
+          <w:numId w:val="12"/>
+        </w:numPr>
+        <w:rPr>
+          <w:sz w:val="32"/>
+          <w:szCs w:val="32"/>
+          <w:lang w:val="en-US"/>
+        </w:rPr>
+      </w:pPr>
+      <w:r>
+        <w:rPr>
+          <w:sz w:val="32"/>
+          <w:szCs w:val="32"/>
+          <w:lang w:val="en-US"/>
+        </w:rPr>
+        <w:t>The right box is floated to the right.</w:t>
+      </w:r>
+    </w:p>
+    <w:p>
+      <w:pPr>
+        <w:pStyle w:val="ListParagraph"/>
+        <w:numPr>
+          <w:ilvl w:val="0"/>
+          <w:numId w:val="12"/>
+        </w:numPr>
+        <w:rPr>
+          <w:sz w:val="32"/>
+          <w:szCs w:val="32"/>
+          <w:lang w:val="en-US"/>
+        </w:rPr>
+      </w:pPr>
+      <w:r>
+        <w:rPr>
+          <w:sz w:val="32"/>
+          <w:szCs w:val="32"/>
+          <w:lang w:val="en-US"/>
+        </w:rPr>
+        <w:t>Margins are used on the middle box to prevent overlap.</w:t>
+      </w:r>
+    </w:p>
+    <w:p>
+      <w:pPr>
+        <w:pStyle w:val="ListParagraph"/>
+        <w:numPr>
+          <w:ilvl w:val="0"/>
+          <w:numId w:val="12"/>
+        </w:numPr>
+        <w:rPr>
+          <w:sz w:val="32"/>
+          <w:szCs w:val="32"/>
+          <w:lang w:val="en-US"/>
+        </w:rPr>
+      </w:pPr>
+      <w:r>
+        <w:rPr>
+          <w:sz w:val="32"/>
+          <w:szCs w:val="32"/>
+          <w:lang w:val="en-US"/>
+        </w:rPr>
+        <w:t>This approach works but is less flexible compared to Flexbox and Grid.</w:t>
+      </w:r>
+    </w:p>
+    <w:p>
+      <w:pPr>
+        <w:rPr>
+          <w:sz w:val="32"/>
+          <w:szCs w:val="32"/>
+          <w:lang w:val="en-US"/>
+        </w:rPr>
+      </w:pPr>
+    </w:p>
+    <w:p>
+      <w:pPr>
+        <w:rPr>
+          <w:sz w:val="32"/>
+          <w:szCs w:val="32"/>
+          <w:lang w:val="en-US"/>
+        </w:rPr>
+      </w:pPr>
+    </w:p>
+    <w:p>
+      <w:pPr>
+        <w:rPr>
+          <w:b/>
+          <w:bCs/>
+          <w:sz w:val="32"/>
+          <w:szCs w:val="32"/>
+          <w:lang w:val="en-US"/>
+        </w:rPr>
+      </w:pPr>
+      <w:proofErr w:type="gramStart"/>
+      <w:r>
+        <w:rPr>
+          <w:b/>
+          <w:bCs/>
+          <w:sz w:val="32"/>
+          <w:szCs w:val="32"/>
+          <w:lang w:val="en-US"/>
+        </w:rPr>
+        <w:lastRenderedPageBreak/>
+        <w:t>Conclusion</w:t>
+      </w:r>
+      <w:r>
+        <w:rPr>
+          <w:b/>
+          <w:bCs/>
+          <w:sz w:val="32"/>
+          <w:szCs w:val="32"/>
+          <w:lang w:val="en-US"/>
+        </w:rPr>
+        <w:t xml:space="preserve"> :</w:t>
+      </w:r>
+      <w:proofErr w:type="gramEnd"/>
+    </w:p>
+    <w:p>
+      <w:pPr>
+        <w:rPr>
+          <w:sz w:val="32"/>
+          <w:szCs w:val="32"/>
+        </w:rPr>
+      </w:pPr>
+      <w:r>
+        <w:rPr>
+          <w:sz w:val="32"/>
+          <w:szCs w:val="32"/>
+        </w:rPr>
+        <w:t>Among all solutions, Flexbox and CSS Grid are the most modern and recommended approaches because they are responsive, easy to maintain, and widely used in modern web development.</w:t>
+      </w:r>
+    </w:p>
+    <w:p>
+      <w:pPr>
+        <w:rPr>
+          <w:sz w:val="32"/>
+          <w:szCs w:val="32"/>
+        </w:rPr>
+      </w:pPr>
+    </w:p>
+    <w:p>
+      <w:pPr>
+        <w:rPr>
+          <w:sz w:val="32"/>
+          <w:szCs w:val="32"/>
+          <w:lang w:val="en-US"/>
+        </w:rPr>
+      </w:pPr>
     </w:p>
     <w:sectPr>
       <w:pgSz w:w="12240" w:h="15840"/>
@@ -5452,6 +7661,232 @@
 <file path=word/numbering.xml><?xml version="1.0" encoding="utf-8"?>
 <w:numbering xmlns:wpc="http://schemas.microsoft.com/office/word/2010/wordprocessingCanvas" xmlns:cx="http://schemas.microsoft.com/office/drawing/2014/chartex" xmlns:cx1="http://schemas.microsoft.com/office/drawing/2015/9/8/chartex" xmlns:cx2="http://schemas.microsoft.com/office/drawing/2015/10/21/chartex" xmlns:cx3="http://schemas.microsoft.com/office/drawing/2016/5/9/chartex" xmlns:cx4="http://schemas.microsoft.com/office/drawing/2016/5/10/chartex" xmlns:cx5="http://schemas.microsoft.com/office/drawing/2016/5/11/chartex" xmlns:cx6="http://schemas.microsoft.com/office/drawing/2016/5/12/chartex" xmlns:cx7="http://schemas.microsoft.com/office/drawing/2016/5/13/chartex" xmlns:cx8="http://schemas.microsoft.com/office/drawing/2016/5/14/chartex" xmlns:mc="http://schemas.openxmlformats.org/markup-compatibility/2006" xmlns:aink="http://schemas.microsoft.com/office/drawing/2016/ink" xmlns:am3d="http://schemas.microsoft.com/office/drawing/2017/model3d" xmlns:o="urn:schemas-microsoft-com:office:office" xmlns:oel="http://schemas.microsoft.com/office/2019/extlst" xmlns:r="http://schemas.openxmlformats.org/officeDocument/2006/relationships" xmlns:m="http://schemas.openxmlformats.org/officeDocument/2006/math" xmlns:v="urn:schemas-microsoft-com:vml" xmlns:wp14="http://schemas.microsoft.com/office/word/2010/wordprocessingDrawing" xmlns:wp="http://schemas.openxmlformats.org/drawingml/2006/wordprocessingDrawing" xmlns:w10="urn:schemas-microsoft-com:office:word" xmlns:w="http://schemas.openxmlformats.org/wordprocessingml/2006/main" xmlns:w14="http://schemas.microsoft.com/office/word/2010/wordml" xmlns:w15="http://schemas.microsoft.com/office/word/2012/wordml" xmlns:w16cex="http://schemas.microsoft.com/office/word/2018/wordml/cex" xmlns:w16cid="http://schemas.microsoft.com/office/word/2016/wordml/cid" xmlns:w16="http://schemas.microsoft.com/office/word/2018/wordml" xmlns:w16du="http://schemas.microsoft.com/office/word/2023/wordml/word16du" xmlns:w16sdtdh="http://schemas.microsoft.com/office/word/2020/wordml/sdtdatahash" xmlns:w16sdtfl="http://schemas.microsoft.com/office/word/2024/wordml/sdtformatlock" xmlns:w16se="http://schemas.microsoft.com/office/word/2015/wordml/symex" xmlns:wpg="http://schemas.microsoft.com/office/word/2010/wordprocessingGroup" xmlns:wpi="http://schemas.microsoft.com/office/word/2010/wordprocessingInk" xmlns:wne="http://schemas.microsoft.com/office/word/2006/wordml" xmlns:wps="http://schemas.microsoft.com/office/word/2010/wordprocessingShape" mc:Ignorable="w14 w15 w16se w16cid w16 w16cex w16sdtdh w16sdtfl w16du wp14">
   <w:abstractNum w:abstractNumId="0" w15:restartNumberingAfterBreak="0">
+    <w:nsid w:val="170A1E16"/>
+    <w:multiLevelType w:val="hybridMultilevel"/>
+    <w:tmpl w:val="CF1ABDD4"/>
+    <w:lvl w:ilvl="0" w:tplc="04090001">
+      <w:start w:val="1"/>
+      <w:numFmt w:val="bullet"/>
+      <w:lvlText w:val=""/>
+      <w:lvlJc w:val="left"/>
+      <w:pPr>
+        <w:ind w:left="720" w:hanging="360"/>
+      </w:pPr>
+      <w:rPr>
+        <w:rFonts w:ascii="Symbol" w:hAnsi="Symbol" w:hint="default"/>
+      </w:rPr>
+    </w:lvl>
+    <w:lvl w:ilvl="1" w:tplc="04090003" w:tentative="1">
+      <w:start w:val="1"/>
+      <w:numFmt w:val="bullet"/>
+      <w:lvlText w:val="o"/>
+      <w:lvlJc w:val="left"/>
+      <w:pPr>
+        <w:ind w:left="1440" w:hanging="360"/>
+      </w:pPr>
+      <w:rPr>
+        <w:rFonts w:ascii="Courier New" w:hAnsi="Courier New" w:cs="Courier New" w:hint="default"/>
+      </w:rPr>
+    </w:lvl>
+    <w:lvl w:ilvl="2" w:tplc="04090005" w:tentative="1">
+      <w:start w:val="1"/>
+      <w:numFmt w:val="bullet"/>
+      <w:lvlText w:val=""/>
+      <w:lvlJc w:val="left"/>
+      <w:pPr>
+        <w:ind w:left="2160" w:hanging="360"/>
+      </w:pPr>
+      <w:rPr>
+        <w:rFonts w:ascii="Wingdings" w:hAnsi="Wingdings" w:hint="default"/>
+      </w:rPr>
+    </w:lvl>
+    <w:lvl w:ilvl="3" w:tplc="04090001" w:tentative="1">
+      <w:start w:val="1"/>
+      <w:numFmt w:val="bullet"/>
+      <w:lvlText w:val=""/>
+      <w:lvlJc w:val="left"/>
+      <w:pPr>
+        <w:ind w:left="2880" w:hanging="360"/>
+      </w:pPr>
+      <w:rPr>
+        <w:rFonts w:ascii="Symbol" w:hAnsi="Symbol" w:hint="default"/>
+      </w:rPr>
+    </w:lvl>
+    <w:lvl w:ilvl="4" w:tplc="04090003" w:tentative="1">
+      <w:start w:val="1"/>
+      <w:numFmt w:val="bullet"/>
+      <w:lvlText w:val="o"/>
+      <w:lvlJc w:val="left"/>
+      <w:pPr>
+        <w:ind w:left="3600" w:hanging="360"/>
+      </w:pPr>
+      <w:rPr>
+        <w:rFonts w:ascii="Courier New" w:hAnsi="Courier New" w:cs="Courier New" w:hint="default"/>
+      </w:rPr>
+    </w:lvl>
+    <w:lvl w:ilvl="5" w:tplc="04090005" w:tentative="1">
+      <w:start w:val="1"/>
+      <w:numFmt w:val="bullet"/>
+      <w:lvlText w:val=""/>
+      <w:lvlJc w:val="left"/>
+      <w:pPr>
+        <w:ind w:left="4320" w:hanging="360"/>
+      </w:pPr>
+      <w:rPr>
+        <w:rFonts w:ascii="Wingdings" w:hAnsi="Wingdings" w:hint="default"/>
+      </w:rPr>
+    </w:lvl>
+    <w:lvl w:ilvl="6" w:tplc="04090001" w:tentative="1">
+      <w:start w:val="1"/>
+      <w:numFmt w:val="bullet"/>
+      <w:lvlText w:val=""/>
+      <w:lvlJc w:val="left"/>
+      <w:pPr>
+        <w:ind w:left="5040" w:hanging="360"/>
+      </w:pPr>
+      <w:rPr>
+        <w:rFonts w:ascii="Symbol" w:hAnsi="Symbol" w:hint="default"/>
+      </w:rPr>
+    </w:lvl>
+    <w:lvl w:ilvl="7" w:tplc="04090003" w:tentative="1">
+      <w:start w:val="1"/>
+      <w:numFmt w:val="bullet"/>
+      <w:lvlText w:val="o"/>
+      <w:lvlJc w:val="left"/>
+      <w:pPr>
+        <w:ind w:left="5760" w:hanging="360"/>
+      </w:pPr>
+      <w:rPr>
+        <w:rFonts w:ascii="Courier New" w:hAnsi="Courier New" w:cs="Courier New" w:hint="default"/>
+      </w:rPr>
+    </w:lvl>
+    <w:lvl w:ilvl="8" w:tplc="04090005" w:tentative="1">
+      <w:start w:val="1"/>
+      <w:numFmt w:val="bullet"/>
+      <w:lvlText w:val=""/>
+      <w:lvlJc w:val="left"/>
+      <w:pPr>
+        <w:ind w:left="6480" w:hanging="360"/>
+      </w:pPr>
+      <w:rPr>
+        <w:rFonts w:ascii="Wingdings" w:hAnsi="Wingdings" w:hint="default"/>
+      </w:rPr>
+    </w:lvl>
+  </w:abstractNum>
+  <w:abstractNum w:abstractNumId="1" w15:restartNumberingAfterBreak="0">
+    <w:nsid w:val="20370458"/>
+    <w:multiLevelType w:val="hybridMultilevel"/>
+    <w:tmpl w:val="A5E4BA2C"/>
+    <w:lvl w:ilvl="0" w:tplc="04090001">
+      <w:start w:val="1"/>
+      <w:numFmt w:val="bullet"/>
+      <w:lvlText w:val=""/>
+      <w:lvlJc w:val="left"/>
+      <w:pPr>
+        <w:ind w:left="720" w:hanging="360"/>
+      </w:pPr>
+      <w:rPr>
+        <w:rFonts w:ascii="Symbol" w:hAnsi="Symbol" w:hint="default"/>
+      </w:rPr>
+    </w:lvl>
+    <w:lvl w:ilvl="1" w:tplc="04090003" w:tentative="1">
+      <w:start w:val="1"/>
+      <w:numFmt w:val="bullet"/>
+      <w:lvlText w:val="o"/>
+      <w:lvlJc w:val="left"/>
+      <w:pPr>
+        <w:ind w:left="1440" w:hanging="360"/>
+      </w:pPr>
+      <w:rPr>
+        <w:rFonts w:ascii="Courier New" w:hAnsi="Courier New" w:cs="Courier New" w:hint="default"/>
+      </w:rPr>
+    </w:lvl>
+    <w:lvl w:ilvl="2" w:tplc="04090005" w:tentative="1">
+      <w:start w:val="1"/>
+      <w:numFmt w:val="bullet"/>
+      <w:lvlText w:val=""/>
+      <w:lvlJc w:val="left"/>
+      <w:pPr>
+        <w:ind w:left="2160" w:hanging="360"/>
+      </w:pPr>
+      <w:rPr>
+        <w:rFonts w:ascii="Wingdings" w:hAnsi="Wingdings" w:hint="default"/>
+      </w:rPr>
+    </w:lvl>
+    <w:lvl w:ilvl="3" w:tplc="04090001" w:tentative="1">
+      <w:start w:val="1"/>
+      <w:numFmt w:val="bullet"/>
+      <w:lvlText w:val=""/>
+      <w:lvlJc w:val="left"/>
+      <w:pPr>
+        <w:ind w:left="2880" w:hanging="360"/>
+      </w:pPr>
+      <w:rPr>
+        <w:rFonts w:ascii="Symbol" w:hAnsi="Symbol" w:hint="default"/>
+      </w:rPr>
+    </w:lvl>
+    <w:lvl w:ilvl="4" w:tplc="04090003" w:tentative="1">
+      <w:start w:val="1"/>
+      <w:numFmt w:val="bullet"/>
+      <w:lvlText w:val="o"/>
+      <w:lvlJc w:val="left"/>
+      <w:pPr>
+        <w:ind w:left="3600" w:hanging="360"/>
+      </w:pPr>
+      <w:rPr>
+        <w:rFonts w:ascii="Courier New" w:hAnsi="Courier New" w:cs="Courier New" w:hint="default"/>
+      </w:rPr>
+    </w:lvl>
+    <w:lvl w:ilvl="5" w:tplc="04090005" w:tentative="1">
+      <w:start w:val="1"/>
+      <w:numFmt w:val="bullet"/>
+      <w:lvlText w:val=""/>
+      <w:lvlJc w:val="left"/>
+      <w:pPr>
+        <w:ind w:left="4320" w:hanging="360"/>
+      </w:pPr>
+      <w:rPr>
+        <w:rFonts w:ascii="Wingdings" w:hAnsi="Wingdings" w:hint="default"/>
+      </w:rPr>
+    </w:lvl>
+    <w:lvl w:ilvl="6" w:tplc="04090001" w:tentative="1">
+      <w:start w:val="1"/>
+      <w:numFmt w:val="bullet"/>
+      <w:lvlText w:val=""/>
+      <w:lvlJc w:val="left"/>
+      <w:pPr>
+        <w:ind w:left="5040" w:hanging="360"/>
+      </w:pPr>
+      <w:rPr>
+        <w:rFonts w:ascii="Symbol" w:hAnsi="Symbol" w:hint="default"/>
+      </w:rPr>
+    </w:lvl>
+    <w:lvl w:ilvl="7" w:tplc="04090003" w:tentative="1">
+      <w:start w:val="1"/>
+      <w:numFmt w:val="bullet"/>
+      <w:lvlText w:val="o"/>
+      <w:lvlJc w:val="left"/>
+      <w:pPr>
+        <w:ind w:left="5760" w:hanging="360"/>
+      </w:pPr>
+      <w:rPr>
+        <w:rFonts w:ascii="Courier New" w:hAnsi="Courier New" w:cs="Courier New" w:hint="default"/>
+      </w:rPr>
+    </w:lvl>
+    <w:lvl w:ilvl="8" w:tplc="04090005" w:tentative="1">
+      <w:start w:val="1"/>
+      <w:numFmt w:val="bullet"/>
+      <w:lvlText w:val=""/>
+      <w:lvlJc w:val="left"/>
+      <w:pPr>
+        <w:ind w:left="6480" w:hanging="360"/>
+      </w:pPr>
+      <w:rPr>
+        <w:rFonts w:ascii="Wingdings" w:hAnsi="Wingdings" w:hint="default"/>
+      </w:rPr>
+    </w:lvl>
+  </w:abstractNum>
+  <w:abstractNum w:abstractNumId="2" w15:restartNumberingAfterBreak="0">
     <w:nsid w:val="468B168B"/>
     <w:multiLevelType w:val="multilevel"/>
     <w:tmpl w:val="068C6986"/>
@@ -5564,7 +7999,346 @@
       </w:rPr>
     </w:lvl>
   </w:abstractNum>
-  <w:abstractNum w:abstractNumId="1" w15:restartNumberingAfterBreak="0">
+  <w:abstractNum w:abstractNumId="3" w15:restartNumberingAfterBreak="0">
+    <w:nsid w:val="48C608A9"/>
+    <w:multiLevelType w:val="hybridMultilevel"/>
+    <w:tmpl w:val="C3064D2A"/>
+    <w:lvl w:ilvl="0" w:tplc="04090001">
+      <w:start w:val="1"/>
+      <w:numFmt w:val="bullet"/>
+      <w:lvlText w:val=""/>
+      <w:lvlJc w:val="left"/>
+      <w:pPr>
+        <w:ind w:left="720" w:hanging="360"/>
+      </w:pPr>
+      <w:rPr>
+        <w:rFonts w:ascii="Symbol" w:hAnsi="Symbol" w:hint="default"/>
+      </w:rPr>
+    </w:lvl>
+    <w:lvl w:ilvl="1" w:tplc="04090003" w:tentative="1">
+      <w:start w:val="1"/>
+      <w:numFmt w:val="bullet"/>
+      <w:lvlText w:val="o"/>
+      <w:lvlJc w:val="left"/>
+      <w:pPr>
+        <w:ind w:left="1440" w:hanging="360"/>
+      </w:pPr>
+      <w:rPr>
+        <w:rFonts w:ascii="Courier New" w:hAnsi="Courier New" w:cs="Courier New" w:hint="default"/>
+      </w:rPr>
+    </w:lvl>
+    <w:lvl w:ilvl="2" w:tplc="04090005" w:tentative="1">
+      <w:start w:val="1"/>
+      <w:numFmt w:val="bullet"/>
+      <w:lvlText w:val=""/>
+      <w:lvlJc w:val="left"/>
+      <w:pPr>
+        <w:ind w:left="2160" w:hanging="360"/>
+      </w:pPr>
+      <w:rPr>
+        <w:rFonts w:ascii="Wingdings" w:hAnsi="Wingdings" w:hint="default"/>
+      </w:rPr>
+    </w:lvl>
+    <w:lvl w:ilvl="3" w:tplc="04090001" w:tentative="1">
+      <w:start w:val="1"/>
+      <w:numFmt w:val="bullet"/>
+      <w:lvlText w:val=""/>
+      <w:lvlJc w:val="left"/>
+      <w:pPr>
+        <w:ind w:left="2880" w:hanging="360"/>
+      </w:pPr>
+      <w:rPr>
+        <w:rFonts w:ascii="Symbol" w:hAnsi="Symbol" w:hint="default"/>
+      </w:rPr>
+    </w:lvl>
+    <w:lvl w:ilvl="4" w:tplc="04090003" w:tentative="1">
+      <w:start w:val="1"/>
+      <w:numFmt w:val="bullet"/>
+      <w:lvlText w:val="o"/>
+      <w:lvlJc w:val="left"/>
+      <w:pPr>
+        <w:ind w:left="3600" w:hanging="360"/>
+      </w:pPr>
+      <w:rPr>
+        <w:rFonts w:ascii="Courier New" w:hAnsi="Courier New" w:cs="Courier New" w:hint="default"/>
+      </w:rPr>
+    </w:lvl>
+    <w:lvl w:ilvl="5" w:tplc="04090005" w:tentative="1">
+      <w:start w:val="1"/>
+      <w:numFmt w:val="bullet"/>
+      <w:lvlText w:val=""/>
+      <w:lvlJc w:val="left"/>
+      <w:pPr>
+        <w:ind w:left="4320" w:hanging="360"/>
+      </w:pPr>
+      <w:rPr>
+        <w:rFonts w:ascii="Wingdings" w:hAnsi="Wingdings" w:hint="default"/>
+      </w:rPr>
+    </w:lvl>
+    <w:lvl w:ilvl="6" w:tplc="04090001" w:tentative="1">
+      <w:start w:val="1"/>
+      <w:numFmt w:val="bullet"/>
+      <w:lvlText w:val=""/>
+      <w:lvlJc w:val="left"/>
+      <w:pPr>
+        <w:ind w:left="5040" w:hanging="360"/>
+      </w:pPr>
+      <w:rPr>
+        <w:rFonts w:ascii="Symbol" w:hAnsi="Symbol" w:hint="default"/>
+      </w:rPr>
+    </w:lvl>
+    <w:lvl w:ilvl="7" w:tplc="04090003" w:tentative="1">
+      <w:start w:val="1"/>
+      <w:numFmt w:val="bullet"/>
+      <w:lvlText w:val="o"/>
+      <w:lvlJc w:val="left"/>
+      <w:pPr>
+        <w:ind w:left="5760" w:hanging="360"/>
+      </w:pPr>
+      <w:rPr>
+        <w:rFonts w:ascii="Courier New" w:hAnsi="Courier New" w:cs="Courier New" w:hint="default"/>
+      </w:rPr>
+    </w:lvl>
+    <w:lvl w:ilvl="8" w:tplc="04090005" w:tentative="1">
+      <w:start w:val="1"/>
+      <w:numFmt w:val="bullet"/>
+      <w:lvlText w:val=""/>
+      <w:lvlJc w:val="left"/>
+      <w:pPr>
+        <w:ind w:left="6480" w:hanging="360"/>
+      </w:pPr>
+      <w:rPr>
+        <w:rFonts w:ascii="Wingdings" w:hAnsi="Wingdings" w:hint="default"/>
+      </w:rPr>
+    </w:lvl>
+  </w:abstractNum>
+  <w:abstractNum w:abstractNumId="4" w15:restartNumberingAfterBreak="0">
+    <w:nsid w:val="48FA55A1"/>
+    <w:multiLevelType w:val="hybridMultilevel"/>
+    <w:tmpl w:val="AB1E3D76"/>
+    <w:lvl w:ilvl="0" w:tplc="04090001">
+      <w:start w:val="1"/>
+      <w:numFmt w:val="bullet"/>
+      <w:lvlText w:val=""/>
+      <w:lvlJc w:val="left"/>
+      <w:pPr>
+        <w:ind w:left="720" w:hanging="360"/>
+      </w:pPr>
+      <w:rPr>
+        <w:rFonts w:ascii="Symbol" w:hAnsi="Symbol" w:hint="default"/>
+      </w:rPr>
+    </w:lvl>
+    <w:lvl w:ilvl="1" w:tplc="04090003" w:tentative="1">
+      <w:start w:val="1"/>
+      <w:numFmt w:val="bullet"/>
+      <w:lvlText w:val="o"/>
+      <w:lvlJc w:val="left"/>
+      <w:pPr>
+        <w:ind w:left="1440" w:hanging="360"/>
+      </w:pPr>
+      <w:rPr>
+        <w:rFonts w:ascii="Courier New" w:hAnsi="Courier New" w:cs="Courier New" w:hint="default"/>
+      </w:rPr>
+    </w:lvl>
+    <w:lvl w:ilvl="2" w:tplc="04090005" w:tentative="1">
+      <w:start w:val="1"/>
+      <w:numFmt w:val="bullet"/>
+      <w:lvlText w:val=""/>
+      <w:lvlJc w:val="left"/>
+      <w:pPr>
+        <w:ind w:left="2160" w:hanging="360"/>
+      </w:pPr>
+      <w:rPr>
+        <w:rFonts w:ascii="Wingdings" w:hAnsi="Wingdings" w:hint="default"/>
+      </w:rPr>
+    </w:lvl>
+    <w:lvl w:ilvl="3" w:tplc="04090001" w:tentative="1">
+      <w:start w:val="1"/>
+      <w:numFmt w:val="bullet"/>
+      <w:lvlText w:val=""/>
+      <w:lvlJc w:val="left"/>
+      <w:pPr>
+        <w:ind w:left="2880" w:hanging="360"/>
+      </w:pPr>
+      <w:rPr>
+        <w:rFonts w:ascii="Symbol" w:hAnsi="Symbol" w:hint="default"/>
+      </w:rPr>
+    </w:lvl>
+    <w:lvl w:ilvl="4" w:tplc="04090003" w:tentative="1">
+      <w:start w:val="1"/>
+      <w:numFmt w:val="bullet"/>
+      <w:lvlText w:val="o"/>
+      <w:lvlJc w:val="left"/>
+      <w:pPr>
+        <w:ind w:left="3600" w:hanging="360"/>
+      </w:pPr>
+      <w:rPr>
+        <w:rFonts w:ascii="Courier New" w:hAnsi="Courier New" w:cs="Courier New" w:hint="default"/>
+      </w:rPr>
+    </w:lvl>
+    <w:lvl w:ilvl="5" w:tplc="04090005" w:tentative="1">
+      <w:start w:val="1"/>
+      <w:numFmt w:val="bullet"/>
+      <w:lvlText w:val=""/>
+      <w:lvlJc w:val="left"/>
+      <w:pPr>
+        <w:ind w:left="4320" w:hanging="360"/>
+      </w:pPr>
+      <w:rPr>
+        <w:rFonts w:ascii="Wingdings" w:hAnsi="Wingdings" w:hint="default"/>
+      </w:rPr>
+    </w:lvl>
+    <w:lvl w:ilvl="6" w:tplc="04090001" w:tentative="1">
+      <w:start w:val="1"/>
+      <w:numFmt w:val="bullet"/>
+      <w:lvlText w:val=""/>
+      <w:lvlJc w:val="left"/>
+      <w:pPr>
+        <w:ind w:left="5040" w:hanging="360"/>
+      </w:pPr>
+      <w:rPr>
+        <w:rFonts w:ascii="Symbol" w:hAnsi="Symbol" w:hint="default"/>
+      </w:rPr>
+    </w:lvl>
+    <w:lvl w:ilvl="7" w:tplc="04090003" w:tentative="1">
+      <w:start w:val="1"/>
+      <w:numFmt w:val="bullet"/>
+      <w:lvlText w:val="o"/>
+      <w:lvlJc w:val="left"/>
+      <w:pPr>
+        <w:ind w:left="5760" w:hanging="360"/>
+      </w:pPr>
+      <w:rPr>
+        <w:rFonts w:ascii="Courier New" w:hAnsi="Courier New" w:cs="Courier New" w:hint="default"/>
+      </w:rPr>
+    </w:lvl>
+    <w:lvl w:ilvl="8" w:tplc="04090005" w:tentative="1">
+      <w:start w:val="1"/>
+      <w:numFmt w:val="bullet"/>
+      <w:lvlText w:val=""/>
+      <w:lvlJc w:val="left"/>
+      <w:pPr>
+        <w:ind w:left="6480" w:hanging="360"/>
+      </w:pPr>
+      <w:rPr>
+        <w:rFonts w:ascii="Wingdings" w:hAnsi="Wingdings" w:hint="default"/>
+      </w:rPr>
+    </w:lvl>
+  </w:abstractNum>
+  <w:abstractNum w:abstractNumId="5" w15:restartNumberingAfterBreak="0">
+    <w:nsid w:val="584E68A8"/>
+    <w:multiLevelType w:val="hybridMultilevel"/>
+    <w:tmpl w:val="6826F4BA"/>
+    <w:lvl w:ilvl="0" w:tplc="04090001">
+      <w:start w:val="1"/>
+      <w:numFmt w:val="bullet"/>
+      <w:lvlText w:val=""/>
+      <w:lvlJc w:val="left"/>
+      <w:pPr>
+        <w:ind w:left="720" w:hanging="360"/>
+      </w:pPr>
+      <w:rPr>
+        <w:rFonts w:ascii="Symbol" w:hAnsi="Symbol" w:hint="default"/>
+      </w:rPr>
+    </w:lvl>
+    <w:lvl w:ilvl="1" w:tplc="04090003" w:tentative="1">
+      <w:start w:val="1"/>
+      <w:numFmt w:val="bullet"/>
+      <w:lvlText w:val="o"/>
+      <w:lvlJc w:val="left"/>
+      <w:pPr>
+        <w:ind w:left="1440" w:hanging="360"/>
+      </w:pPr>
+      <w:rPr>
+        <w:rFonts w:ascii="Courier New" w:hAnsi="Courier New" w:cs="Courier New" w:hint="default"/>
+      </w:rPr>
+    </w:lvl>
+    <w:lvl w:ilvl="2" w:tplc="04090005" w:tentative="1">
+      <w:start w:val="1"/>
+      <w:numFmt w:val="bullet"/>
+      <w:lvlText w:val=""/>
+      <w:lvlJc w:val="left"/>
+      <w:pPr>
+        <w:ind w:left="2160" w:hanging="360"/>
+      </w:pPr>
+      <w:rPr>
+        <w:rFonts w:ascii="Wingdings" w:hAnsi="Wingdings" w:hint="default"/>
+      </w:rPr>
+    </w:lvl>
+    <w:lvl w:ilvl="3" w:tplc="04090001" w:tentative="1">
+      <w:start w:val="1"/>
+      <w:numFmt w:val="bullet"/>
+      <w:lvlText w:val=""/>
+      <w:lvlJc w:val="left"/>
+      <w:pPr>
+        <w:ind w:left="2880" w:hanging="360"/>
+      </w:pPr>
+      <w:rPr>
+        <w:rFonts w:ascii="Symbol" w:hAnsi="Symbol" w:hint="default"/>
+      </w:rPr>
+    </w:lvl>
+    <w:lvl w:ilvl="4" w:tplc="04090003" w:tentative="1">
+      <w:start w:val="1"/>
+      <w:numFmt w:val="bullet"/>
+      <w:lvlText w:val="o"/>
+      <w:lvlJc w:val="left"/>
+      <w:pPr>
+        <w:ind w:left="3600" w:hanging="360"/>
+      </w:pPr>
+      <w:rPr>
+        <w:rFonts w:ascii="Courier New" w:hAnsi="Courier New" w:cs="Courier New" w:hint="default"/>
+      </w:rPr>
+    </w:lvl>
+    <w:lvl w:ilvl="5" w:tplc="04090005" w:tentative="1">
+      <w:start w:val="1"/>
+      <w:numFmt w:val="bullet"/>
+      <w:lvlText w:val=""/>
+      <w:lvlJc w:val="left"/>
+      <w:pPr>
+        <w:ind w:left="4320" w:hanging="360"/>
+      </w:pPr>
+      <w:rPr>
+        <w:rFonts w:ascii="Wingdings" w:hAnsi="Wingdings" w:hint="default"/>
+      </w:rPr>
+    </w:lvl>
+    <w:lvl w:ilvl="6" w:tplc="04090001" w:tentative="1">
+      <w:start w:val="1"/>
+      <w:numFmt w:val="bullet"/>
+      <w:lvlText w:val=""/>
+      <w:lvlJc w:val="left"/>
+      <w:pPr>
+        <w:ind w:left="5040" w:hanging="360"/>
+      </w:pPr>
+      <w:rPr>
+        <w:rFonts w:ascii="Symbol" w:hAnsi="Symbol" w:hint="default"/>
+      </w:rPr>
+    </w:lvl>
+    <w:lvl w:ilvl="7" w:tplc="04090003" w:tentative="1">
+      <w:start w:val="1"/>
+      <w:numFmt w:val="bullet"/>
+      <w:lvlText w:val="o"/>
+      <w:lvlJc w:val="left"/>
+      <w:pPr>
+        <w:ind w:left="5760" w:hanging="360"/>
+      </w:pPr>
+      <w:rPr>
+        <w:rFonts w:ascii="Courier New" w:hAnsi="Courier New" w:cs="Courier New" w:hint="default"/>
+      </w:rPr>
+    </w:lvl>
+    <w:lvl w:ilvl="8" w:tplc="04090005" w:tentative="1">
+      <w:start w:val="1"/>
+      <w:numFmt w:val="bullet"/>
+      <w:lvlText w:val=""/>
+      <w:lvlJc w:val="left"/>
+      <w:pPr>
+        <w:ind w:left="6480" w:hanging="360"/>
+      </w:pPr>
+      <w:rPr>
+        <w:rFonts w:ascii="Wingdings" w:hAnsi="Wingdings" w:hint="default"/>
+      </w:rPr>
+    </w:lvl>
+  </w:abstractNum>
+  <w:abstractNum w:abstractNumId="6" w15:restartNumberingAfterBreak="0">
     <w:nsid w:val="58DC37C4"/>
     <w:multiLevelType w:val="multilevel"/>
     <w:tmpl w:val="3C7CACA8"/>
@@ -5677,7 +8451,7 @@
       </w:rPr>
     </w:lvl>
   </w:abstractNum>
-  <w:abstractNum w:abstractNumId="2" w15:restartNumberingAfterBreak="0">
+  <w:abstractNum w:abstractNumId="7" w15:restartNumberingAfterBreak="0">
     <w:nsid w:val="69B05CD0"/>
     <w:multiLevelType w:val="multilevel"/>
     <w:tmpl w:val="D8AE02D4"/>
@@ -5790,7 +8564,120 @@
       </w:rPr>
     </w:lvl>
   </w:abstractNum>
-  <w:abstractNum w:abstractNumId="3" w15:restartNumberingAfterBreak="0">
+  <w:abstractNum w:abstractNumId="8" w15:restartNumberingAfterBreak="0">
+    <w:nsid w:val="748A148A"/>
+    <w:multiLevelType w:val="hybridMultilevel"/>
+    <w:tmpl w:val="5ACC97D6"/>
+    <w:lvl w:ilvl="0" w:tplc="04090001">
+      <w:start w:val="1"/>
+      <w:numFmt w:val="bullet"/>
+      <w:lvlText w:val=""/>
+      <w:lvlJc w:val="left"/>
+      <w:pPr>
+        <w:ind w:left="720" w:hanging="360"/>
+      </w:pPr>
+      <w:rPr>
+        <w:rFonts w:ascii="Symbol" w:hAnsi="Symbol" w:hint="default"/>
+      </w:rPr>
+    </w:lvl>
+    <w:lvl w:ilvl="1" w:tplc="04090003" w:tentative="1">
+      <w:start w:val="1"/>
+      <w:numFmt w:val="bullet"/>
+      <w:lvlText w:val="o"/>
+      <w:lvlJc w:val="left"/>
+      <w:pPr>
+        <w:ind w:left="1440" w:hanging="360"/>
+      </w:pPr>
+      <w:rPr>
+        <w:rFonts w:ascii="Courier New" w:hAnsi="Courier New" w:cs="Courier New" w:hint="default"/>
+      </w:rPr>
+    </w:lvl>
+    <w:lvl w:ilvl="2" w:tplc="04090005" w:tentative="1">
+      <w:start w:val="1"/>
+      <w:numFmt w:val="bullet"/>
+      <w:lvlText w:val=""/>
+      <w:lvlJc w:val="left"/>
+      <w:pPr>
+        <w:ind w:left="2160" w:hanging="360"/>
+      </w:pPr>
+      <w:rPr>
+        <w:rFonts w:ascii="Wingdings" w:hAnsi="Wingdings" w:hint="default"/>
+      </w:rPr>
+    </w:lvl>
+    <w:lvl w:ilvl="3" w:tplc="04090001" w:tentative="1">
+      <w:start w:val="1"/>
+      <w:numFmt w:val="bullet"/>
+      <w:lvlText w:val=""/>
+      <w:lvlJc w:val="left"/>
+      <w:pPr>
+        <w:ind w:left="2880" w:hanging="360"/>
+      </w:pPr>
+      <w:rPr>
+        <w:rFonts w:ascii="Symbol" w:hAnsi="Symbol" w:hint="default"/>
+      </w:rPr>
+    </w:lvl>
+    <w:lvl w:ilvl="4" w:tplc="04090003" w:tentative="1">
+      <w:start w:val="1"/>
+      <w:numFmt w:val="bullet"/>
+      <w:lvlText w:val="o"/>
+      <w:lvlJc w:val="left"/>
+      <w:pPr>
+        <w:ind w:left="3600" w:hanging="360"/>
+      </w:pPr>
+      <w:rPr>
+        <w:rFonts w:ascii="Courier New" w:hAnsi="Courier New" w:cs="Courier New" w:hint="default"/>
+      </w:rPr>
+    </w:lvl>
+    <w:lvl w:ilvl="5" w:tplc="04090005" w:tentative="1">
+      <w:start w:val="1"/>
+      <w:numFmt w:val="bullet"/>
+      <w:lvlText w:val=""/>
+      <w:lvlJc w:val="left"/>
+      <w:pPr>
+        <w:ind w:left="4320" w:hanging="360"/>
+      </w:pPr>
+      <w:rPr>
+        <w:rFonts w:ascii="Wingdings" w:hAnsi="Wingdings" w:hint="default"/>
+      </w:rPr>
+    </w:lvl>
+    <w:lvl w:ilvl="6" w:tplc="04090001" w:tentative="1">
+      <w:start w:val="1"/>
+      <w:numFmt w:val="bullet"/>
+      <w:lvlText w:val=""/>
+      <w:lvlJc w:val="left"/>
+      <w:pPr>
+        <w:ind w:left="5040" w:hanging="360"/>
+      </w:pPr>
+      <w:rPr>
+        <w:rFonts w:ascii="Symbol" w:hAnsi="Symbol" w:hint="default"/>
+      </w:rPr>
+    </w:lvl>
+    <w:lvl w:ilvl="7" w:tplc="04090003" w:tentative="1">
+      <w:start w:val="1"/>
+      <w:numFmt w:val="bullet"/>
+      <w:lvlText w:val="o"/>
+      <w:lvlJc w:val="left"/>
+      <w:pPr>
+        <w:ind w:left="5760" w:hanging="360"/>
+      </w:pPr>
+      <w:rPr>
+        <w:rFonts w:ascii="Courier New" w:hAnsi="Courier New" w:cs="Courier New" w:hint="default"/>
+      </w:rPr>
+    </w:lvl>
+    <w:lvl w:ilvl="8" w:tplc="04090005" w:tentative="1">
+      <w:start w:val="1"/>
+      <w:numFmt w:val="bullet"/>
+      <w:lvlText w:val=""/>
+      <w:lvlJc w:val="left"/>
+      <w:pPr>
+        <w:ind w:left="6480" w:hanging="360"/>
+      </w:pPr>
+      <w:rPr>
+        <w:rFonts w:ascii="Wingdings" w:hAnsi="Wingdings" w:hint="default"/>
+      </w:rPr>
+    </w:lvl>
+  </w:abstractNum>
+  <w:abstractNum w:abstractNumId="9" w15:restartNumberingAfterBreak="0">
     <w:nsid w:val="77A550EC"/>
     <w:multiLevelType w:val="hybridMultilevel"/>
     <w:tmpl w:val="59825318"/>
@@ -5903,17 +8790,267 @@
       </w:rPr>
     </w:lvl>
   </w:abstractNum>
+  <w:abstractNum w:abstractNumId="10" w15:restartNumberingAfterBreak="0">
+    <w:nsid w:val="7CB16BAD"/>
+    <w:multiLevelType w:val="hybridMultilevel"/>
+    <w:tmpl w:val="4D2CECDC"/>
+    <w:lvl w:ilvl="0" w:tplc="04090001">
+      <w:start w:val="1"/>
+      <w:numFmt w:val="bullet"/>
+      <w:lvlText w:val=""/>
+      <w:lvlJc w:val="left"/>
+      <w:pPr>
+        <w:ind w:left="720" w:hanging="360"/>
+      </w:pPr>
+      <w:rPr>
+        <w:rFonts w:ascii="Symbol" w:hAnsi="Symbol" w:hint="default"/>
+      </w:rPr>
+    </w:lvl>
+    <w:lvl w:ilvl="1" w:tplc="04090003" w:tentative="1">
+      <w:start w:val="1"/>
+      <w:numFmt w:val="bullet"/>
+      <w:lvlText w:val="o"/>
+      <w:lvlJc w:val="left"/>
+      <w:pPr>
+        <w:ind w:left="1440" w:hanging="360"/>
+      </w:pPr>
+      <w:rPr>
+        <w:rFonts w:ascii="Courier New" w:hAnsi="Courier New" w:cs="Courier New" w:hint="default"/>
+      </w:rPr>
+    </w:lvl>
+    <w:lvl w:ilvl="2" w:tplc="04090005" w:tentative="1">
+      <w:start w:val="1"/>
+      <w:numFmt w:val="bullet"/>
+      <w:lvlText w:val=""/>
+      <w:lvlJc w:val="left"/>
+      <w:pPr>
+        <w:ind w:left="2160" w:hanging="360"/>
+      </w:pPr>
+      <w:rPr>
+        <w:rFonts w:ascii="Wingdings" w:hAnsi="Wingdings" w:hint="default"/>
+      </w:rPr>
+    </w:lvl>
+    <w:lvl w:ilvl="3" w:tplc="04090001" w:tentative="1">
+      <w:start w:val="1"/>
+      <w:numFmt w:val="bullet"/>
+      <w:lvlText w:val=""/>
+      <w:lvlJc w:val="left"/>
+      <w:pPr>
+        <w:ind w:left="2880" w:hanging="360"/>
+      </w:pPr>
+      <w:rPr>
+        <w:rFonts w:ascii="Symbol" w:hAnsi="Symbol" w:hint="default"/>
+      </w:rPr>
+    </w:lvl>
+    <w:lvl w:ilvl="4" w:tplc="04090003" w:tentative="1">
+      <w:start w:val="1"/>
+      <w:numFmt w:val="bullet"/>
+      <w:lvlText w:val="o"/>
+      <w:lvlJc w:val="left"/>
+      <w:pPr>
+        <w:ind w:left="3600" w:hanging="360"/>
+      </w:pPr>
+      <w:rPr>
+        <w:rFonts w:ascii="Courier New" w:hAnsi="Courier New" w:cs="Courier New" w:hint="default"/>
+      </w:rPr>
+    </w:lvl>
+    <w:lvl w:ilvl="5" w:tplc="04090005" w:tentative="1">
+      <w:start w:val="1"/>
+      <w:numFmt w:val="bullet"/>
+      <w:lvlText w:val=""/>
+      <w:lvlJc w:val="left"/>
+      <w:pPr>
+        <w:ind w:left="4320" w:hanging="360"/>
+      </w:pPr>
+      <w:rPr>
+        <w:rFonts w:ascii="Wingdings" w:hAnsi="Wingdings" w:hint="default"/>
+      </w:rPr>
+    </w:lvl>
+    <w:lvl w:ilvl="6" w:tplc="04090001" w:tentative="1">
+      <w:start w:val="1"/>
+      <w:numFmt w:val="bullet"/>
+      <w:lvlText w:val=""/>
+      <w:lvlJc w:val="left"/>
+      <w:pPr>
+        <w:ind w:left="5040" w:hanging="360"/>
+      </w:pPr>
+      <w:rPr>
+        <w:rFonts w:ascii="Symbol" w:hAnsi="Symbol" w:hint="default"/>
+      </w:rPr>
+    </w:lvl>
+    <w:lvl w:ilvl="7" w:tplc="04090003" w:tentative="1">
+      <w:start w:val="1"/>
+      <w:numFmt w:val="bullet"/>
+      <w:lvlText w:val="o"/>
+      <w:lvlJc w:val="left"/>
+      <w:pPr>
+        <w:ind w:left="5760" w:hanging="360"/>
+      </w:pPr>
+      <w:rPr>
+        <w:rFonts w:ascii="Courier New" w:hAnsi="Courier New" w:cs="Courier New" w:hint="default"/>
+      </w:rPr>
+    </w:lvl>
+    <w:lvl w:ilvl="8" w:tplc="04090005" w:tentative="1">
+      <w:start w:val="1"/>
+      <w:numFmt w:val="bullet"/>
+      <w:lvlText w:val=""/>
+      <w:lvlJc w:val="left"/>
+      <w:pPr>
+        <w:ind w:left="6480" w:hanging="360"/>
+      </w:pPr>
+      <w:rPr>
+        <w:rFonts w:ascii="Wingdings" w:hAnsi="Wingdings" w:hint="default"/>
+      </w:rPr>
+    </w:lvl>
+  </w:abstractNum>
+  <w:abstractNum w:abstractNumId="11" w15:restartNumberingAfterBreak="0">
+    <w:nsid w:val="7E820A7E"/>
+    <w:multiLevelType w:val="hybridMultilevel"/>
+    <w:tmpl w:val="7CA8A474"/>
+    <w:lvl w:ilvl="0" w:tplc="04090001">
+      <w:start w:val="1"/>
+      <w:numFmt w:val="bullet"/>
+      <w:lvlText w:val=""/>
+      <w:lvlJc w:val="left"/>
+      <w:pPr>
+        <w:ind w:left="720" w:hanging="360"/>
+      </w:pPr>
+      <w:rPr>
+        <w:rFonts w:ascii="Symbol" w:hAnsi="Symbol" w:hint="default"/>
+      </w:rPr>
+    </w:lvl>
+    <w:lvl w:ilvl="1" w:tplc="04090003" w:tentative="1">
+      <w:start w:val="1"/>
+      <w:numFmt w:val="bullet"/>
+      <w:lvlText w:val="o"/>
+      <w:lvlJc w:val="left"/>
+      <w:pPr>
+        <w:ind w:left="1440" w:hanging="360"/>
+      </w:pPr>
+      <w:rPr>
+        <w:rFonts w:ascii="Courier New" w:hAnsi="Courier New" w:cs="Courier New" w:hint="default"/>
+      </w:rPr>
+    </w:lvl>
+    <w:lvl w:ilvl="2" w:tplc="04090005" w:tentative="1">
+      <w:start w:val="1"/>
+      <w:numFmt w:val="bullet"/>
+      <w:lvlText w:val=""/>
+      <w:lvlJc w:val="left"/>
+      <w:pPr>
+        <w:ind w:left="2160" w:hanging="360"/>
+      </w:pPr>
+      <w:rPr>
+        <w:rFonts w:ascii="Wingdings" w:hAnsi="Wingdings" w:hint="default"/>
+      </w:rPr>
+    </w:lvl>
+    <w:lvl w:ilvl="3" w:tplc="04090001" w:tentative="1">
+      <w:start w:val="1"/>
+      <w:numFmt w:val="bullet"/>
+      <w:lvlText w:val=""/>
+      <w:lvlJc w:val="left"/>
+      <w:pPr>
+        <w:ind w:left="2880" w:hanging="360"/>
+      </w:pPr>
+      <w:rPr>
+        <w:rFonts w:ascii="Symbol" w:hAnsi="Symbol" w:hint="default"/>
+      </w:rPr>
+    </w:lvl>
+    <w:lvl w:ilvl="4" w:tplc="04090003" w:tentative="1">
+      <w:start w:val="1"/>
+      <w:numFmt w:val="bullet"/>
+      <w:lvlText w:val="o"/>
+      <w:lvlJc w:val="left"/>
+      <w:pPr>
+        <w:ind w:left="3600" w:hanging="360"/>
+      </w:pPr>
+      <w:rPr>
+        <w:rFonts w:ascii="Courier New" w:hAnsi="Courier New" w:cs="Courier New" w:hint="default"/>
+      </w:rPr>
+    </w:lvl>
+    <w:lvl w:ilvl="5" w:tplc="04090005" w:tentative="1">
+      <w:start w:val="1"/>
+      <w:numFmt w:val="bullet"/>
+      <w:lvlText w:val=""/>
+      <w:lvlJc w:val="left"/>
+      <w:pPr>
+        <w:ind w:left="4320" w:hanging="360"/>
+      </w:pPr>
+      <w:rPr>
+        <w:rFonts w:ascii="Wingdings" w:hAnsi="Wingdings" w:hint="default"/>
+      </w:rPr>
+    </w:lvl>
+    <w:lvl w:ilvl="6" w:tplc="04090001" w:tentative="1">
+      <w:start w:val="1"/>
+      <w:numFmt w:val="bullet"/>
+      <w:lvlText w:val=""/>
+      <w:lvlJc w:val="left"/>
+      <w:pPr>
+        <w:ind w:left="5040" w:hanging="360"/>
+      </w:pPr>
+      <w:rPr>
+        <w:rFonts w:ascii="Symbol" w:hAnsi="Symbol" w:hint="default"/>
+      </w:rPr>
+    </w:lvl>
+    <w:lvl w:ilvl="7" w:tplc="04090003" w:tentative="1">
+      <w:start w:val="1"/>
+      <w:numFmt w:val="bullet"/>
+      <w:lvlText w:val="o"/>
+      <w:lvlJc w:val="left"/>
+      <w:pPr>
+        <w:ind w:left="5760" w:hanging="360"/>
+      </w:pPr>
+      <w:rPr>
+        <w:rFonts w:ascii="Courier New" w:hAnsi="Courier New" w:cs="Courier New" w:hint="default"/>
+      </w:rPr>
+    </w:lvl>
+    <w:lvl w:ilvl="8" w:tplc="04090005" w:tentative="1">
+      <w:start w:val="1"/>
+      <w:numFmt w:val="bullet"/>
+      <w:lvlText w:val=""/>
+      <w:lvlJc w:val="left"/>
+      <w:pPr>
+        <w:ind w:left="6480" w:hanging="360"/>
+      </w:pPr>
+      <w:rPr>
+        <w:rFonts w:ascii="Wingdings" w:hAnsi="Wingdings" w:hint="default"/>
+      </w:rPr>
+    </w:lvl>
+  </w:abstractNum>
   <w:num w:numId="1" w16cid:durableId="379089047">
+    <w:abstractNumId w:val="7"/>
+  </w:num>
+  <w:num w:numId="2" w16cid:durableId="1989554475">
+    <w:abstractNumId w:val="6"/>
+  </w:num>
+  <w:num w:numId="3" w16cid:durableId="907615511">
     <w:abstractNumId w:val="2"/>
   </w:num>
-  <w:num w:numId="2" w16cid:durableId="1989554475">
-    <w:abstractNumId w:val="1"/>
+  <w:num w:numId="4" w16cid:durableId="1349940755">
+    <w:abstractNumId w:val="9"/>
   </w:num>
-  <w:num w:numId="3" w16cid:durableId="907615511">
+  <w:num w:numId="5" w16cid:durableId="1675768612">
     <w:abstractNumId w:val="0"/>
   </w:num>
-  <w:num w:numId="4" w16cid:durableId="1349940755">
+  <w:num w:numId="6" w16cid:durableId="635793782">
+    <w:abstractNumId w:val="11"/>
+  </w:num>
+  <w:num w:numId="7" w16cid:durableId="948662025">
+    <w:abstractNumId w:val="10"/>
+  </w:num>
+  <w:num w:numId="8" w16cid:durableId="1569153189">
+    <w:abstractNumId w:val="5"/>
+  </w:num>
+  <w:num w:numId="9" w16cid:durableId="754011276">
+    <w:abstractNumId w:val="4"/>
+  </w:num>
+  <w:num w:numId="10" w16cid:durableId="193345070">
     <w:abstractNumId w:val="3"/>
+  </w:num>
+  <w:num w:numId="11" w16cid:durableId="2010518965">
+    <w:abstractNumId w:val="8"/>
+  </w:num>
+  <w:num w:numId="12" w16cid:durableId="1976519415">
+    <w:abstractNumId w:val="1"/>
   </w:num>
 </w:numbering>
 </file>

</xml_diff>